<commit_message>
A Menina Elefante: revisão final e livro inteiro gerado
Registra a aprovação da autora (visita ao pai, "Mãe sabe", cubo montado
pela Luciana), atualiza a contagem e regenera todos os .docx.

Co-Authored-By: Claude Opus 5.5 <noreply@anthropic.com>
Claude-Session: https://claude.ai/code/session_011ZTeK22H8KBNtWenzEUTZE
</commit_message>
<xml_diff>
--- a/menina_elefante/saidas/A_Menina_Elefante_V2_Parte_I.docx
+++ b/menina_elefante/saidas/A_Menina_Elefante_V2_Parte_I.docx
@@ -302,7 +302,7 @@
     </w:p>
     <w:p>
       <w:r>
-        <w:t xml:space="preserve">Procurei minha mãe entre os pais. Ela estava bem atrás do fotógrafo, com a bolsa apertada debaixo do braço, onde estava o envelope. Tinha o rosto de quem espera o resultado de alguma coisa. Meu pai estava ao lado dela, de camisa aberta no peito e óculos escuros, o único pai de óculos escuros do pátio inteiro, e me fez um joinha com as duas mãos.</w:t>
+        <w:t xml:space="preserve">Procurei minha mãe entre os pais. Ela estava bem atrás do fotógrafo, com a bolsa apertada debaixo do braço, onde estava o envelope. Tinha o rosto de quem espera o resultado de alguma coisa. Meu pai estava ao lado dela, de camisa aberta no peito e óculos escuros, o único pai de óculos escuros do pátio inteiro. Tinha tirado os óculos da vitrine da ótica naquela manhã, com a etiqueta de preço ainda escondida na haste, e minha mãe fingia não saber. Ele me fez um joinha com as duas mãos.</w:t>
       </w:r>
     </w:p>
     <w:p>
@@ -643,7 +643,7 @@
     </w:p>
     <w:p>
       <w:r>
-        <w:t xml:space="preserve">Isso parecia um talento, e era. A professora escreveu no meu boletim da terceira série, no espaço de observações, com letra redonda: "Aluna muito sociável, se dá bem com todos os colegas." Minha mãe leu em voz alta na cozinha, duas vezes, e depois pendurou o boletim na porta da geladeira com um ímã de banana.</w:t>
+        <w:t xml:space="preserve">Isso parecia um talento, e era. A professora escreveu no meu boletim da terceira série, no espaço de observações, com letra redonda: "Aluna muito sociável, se dá bem com todos os colegas." Minha mãe leu em voz alta na cozinha, duas vezes, depois levou o boletim para mostrar às clientes da ótica e, à noite, pendurou na porta da geladeira com um ímã de banana.</w:t>
       </w:r>
     </w:p>
     <w:p>

</xml_diff>

<commit_message>
A Menina Elefante: revisão de ritmo e diagramação de livro (~200 páginas)
- Relatório de edição estrutural em wiki/dev-edit-reports/.
- Enxugamento leve nas Partes I–III; correções de continuidade (caps. 7,
  10, 12, 17, 18); sementes de tensão nos caps. 21 (Kousuke) e 23 (o pai).
- build.py: EB Garamond 12 pt com entrelinha exata, margens espelhadas,
  hifenização pt-BR, cabeçalhos pares/ímpares, aberturas de capítulo e
  páginas de parte e de destaque sem cabeçalho, fontes OFL embutidas.

Co-Authored-By: Claude Opus 5.5 <noreply@anthropic.com>
Claude-Session: https://claude.ai/code/session_011ZTeK22H8KBNtWenzEUTZE
</commit_message>
<xml_diff>
--- a/menina_elefante/saidas/A_Menina_Elefante_V2_Parte_I.docx
+++ b/menina_elefante/saidas/A_Menina_Elefante_V2_Parte_I.docx
@@ -4,30 +4,106 @@
   <w:body>
     <w:p>
       <w:pPr>
-        <w:pStyle w:val="MyPartTitle"/>
-        <w:spacing w:before="2400"/>
+        <w:keepNext/>
+        <w:spacing w:before="0" w:after="300" w:line="240" w:lineRule="auto"/>
+        <w:ind w:firstLine="0"/>
+        <w:jc w:val="center"/>
       </w:pPr>
       <w:r>
-        <w:t xml:space="preserve">PARTE I — O PERSONAGEM</w:t>
-      </w:r>
-    </w:p>
-    <w:p>
-      <w:r>
-        <w:br w:type="page"/>
+        <w:rPr>
+          <w:rFonts w:ascii="EB Garamond" w:hAnsi="EB Garamond"/>
+          <w:color w:val="555555"/>
+          <w:spacing w:val="60"/>
+          <w:sz w:val="22"/>
+          <w:szCs w:val="22"/>
+        </w:rPr>
+        <w:t xml:space="preserve">PARTE I</w:t>
       </w:r>
     </w:p>
     <w:p>
       <w:pPr>
-        <w:pStyle w:val="MyChapterTitle"/>
-        <w:spacing w:before="1440" w:after="560"/>
+        <w:keepNext/>
+        <w:spacing w:before="0" w:after="0" w:line="240" w:lineRule="auto"/>
+        <w:ind w:firstLine="0"/>
+        <w:jc w:val="center"/>
       </w:pPr>
       <w:r>
-        <w:t xml:space="preserve">CAPÍTULO 1 — A FRANJINHA</w:t>
+        <w:rPr>
+          <w:rFonts w:ascii="EB Garamond" w:hAnsi="EB Garamond"/>
+          <w:spacing w:val="20"/>
+          <w:sz w:val="40"/>
+          <w:szCs w:val="40"/>
+        </w:rPr>
+        <w:t xml:space="preserve">O PERSONAGEM</w:t>
       </w:r>
     </w:p>
     <w:p>
+      <w:pPr>
+        <w:spacing w:before="0" w:after="0" w:line="20" w:lineRule="exact"/>
+        <w:ind w:firstLine="0"/>
+        <w:sectPr>
+          <w:headerReference w:type="even" r:id="rIdHVazio"/>
+          <w:headerReference w:type="default" r:id="rIdHVazio"/>
+          <w:headerReference w:type="first" r:id="rIdHVazio"/>
+          <w:footerReference w:type="even" r:id="rIdFVazio"/>
+          <w:footerReference w:type="default" r:id="rIdFVazio"/>
+          <w:footerReference w:type="first" r:id="rIdFVazio"/>
+          <w:type w:val="nextPage"/>
+          <w:pgSz w:w="7920" w:h="12240"/>
+          <w:pgMar w:top="1000" w:right="870" w:bottom="1000" w:left="1150" w:header="560" w:footer="560" w:gutter="0"/>
+          <w:cols w:space="720"/>
+          <w:vAlign w:val="center"/>
+          <w:docGrid w:linePitch="360"/>
+        </w:sectPr>
+      </w:pPr>
+    </w:p>
+    <w:p>
+      <w:pPr>
+        <w:keepNext/>
+        <w:spacing w:before="1500" w:after="160" w:line="240" w:lineRule="auto"/>
+        <w:ind w:firstLine="0"/>
+        <w:jc w:val="center"/>
+      </w:pPr>
       <w:r>
-        <w:t xml:space="preserve">Minha mãe cortou a franja na véspera, na cozinha, com a tesoura de destrinchar frango.</w:t>
+        <w:rPr>
+          <w:rFonts w:ascii="EB Garamond" w:hAnsi="EB Garamond"/>
+          <w:color w:val="555555"/>
+          <w:spacing w:val="40"/>
+          <w:sz w:val="19"/>
+          <w:szCs w:val="19"/>
+        </w:rPr>
+        <w:t xml:space="preserve">CAPÍTULO 1</w:t>
+      </w:r>
+    </w:p>
+    <w:p>
+      <w:pPr>
+        <w:keepNext/>
+        <w:spacing w:before="0" w:after="900" w:line="240" w:lineRule="auto"/>
+        <w:ind w:firstLine="0"/>
+        <w:jc w:val="center"/>
+      </w:pPr>
+      <w:r>
+        <w:rPr>
+          <w:rFonts w:ascii="EB Garamond" w:hAnsi="EB Garamond"/>
+          <w:spacing w:val="10"/>
+          <w:sz w:val="34"/>
+          <w:szCs w:val="34"/>
+        </w:rPr>
+        <w:t xml:space="preserve">A FRANJINHA</w:t>
+      </w:r>
+    </w:p>
+    <w:p>
+      <w:pPr>
+        <w:ind w:firstLine="0"/>
+      </w:pPr>
+      <w:r>
+        <w:rPr>
+          <w:smallCaps/>
+        </w:rPr>
+        <w:t xml:space="preserve">Minha mãe cortou a</w:t>
+      </w:r>
+      <w:r>
+        <w:t xml:space="preserve"> franja na véspera, na cozinha, com a tesoura de destrinchar frango.</w:t>
       </w:r>
     </w:p>
     <w:p>
@@ -36,25 +112,16 @@
       </w:r>
     </w:p>
     <w:p>
-      <w:pPr>
-        <w:ind w:firstLine="0"/>
-      </w:pPr>
       <w:r>
         <w:t xml:space="preserve">— Não mexe.</w:t>
       </w:r>
     </w:p>
     <w:p>
-      <w:pPr>
-        <w:ind w:firstLine="0"/>
-      </w:pPr>
       <w:r>
         <w:t xml:space="preserve">— Tá gelado.</w:t>
       </w:r>
     </w:p>
     <w:p>
-      <w:pPr>
-        <w:ind w:firstLine="0"/>
-      </w:pPr>
       <w:r>
         <w:t xml:space="preserve">— É só a tigela. Não mexe.</w:t>
       </w:r>
@@ -66,21 +133,15 @@
     </w:p>
     <w:p>
       <w:r>
-        <w:t xml:space="preserve">Na sala, meu pai assistia ao jornal com os pés em cima da mesinha, coisa que minha mãe proibia e ele fazia mesmo assim, sempre que ela estava ocupada. De vez em quando ele esticava o pescoço para ver a gente pela porta.</w:t>
+        <w:t xml:space="preserve">Na sala, meu pai assistia ao jornal com os pés em cima da mesinha, coisa que minha mãe proibia e ele fazia mesmo assim, sempre que ela estava ocupada.</w:t>
       </w:r>
     </w:p>
     <w:p>
-      <w:pPr>
-        <w:ind w:firstLine="0"/>
-      </w:pPr>
       <w:r>
         <w:t xml:space="preserve">— Nair, você está cortando o cabelo da menina ou fazendo coxinha?</w:t>
       </w:r>
     </w:p>
     <w:p>
-      <w:pPr>
-        <w:ind w:firstLine="0"/>
-      </w:pPr>
       <w:r>
         <w:t xml:space="preserve">— Yoshinori, vai assistir tua televisão.</w:t>
       </w:r>
@@ -91,9 +152,6 @@
       </w:r>
     </w:p>
     <w:p>
-      <w:pPr>
-        <w:ind w:firstLine="0"/>
-      </w:pPr>
       <w:r>
         <w:t xml:space="preserve">— Encolhe quando seca — disse.</w:t>
       </w:r>
@@ -104,25 +162,16 @@
       </w:r>
     </w:p>
     <w:p>
-      <w:pPr>
-        <w:ind w:firstLine="0"/>
-      </w:pPr>
       <w:r>
         <w:t xml:space="preserve">— Ficou igualzinha à Mônica.</w:t>
       </w:r>
     </w:p>
     <w:p>
-      <w:pPr>
-        <w:ind w:firstLine="0"/>
-      </w:pPr>
       <w:r>
         <w:t xml:space="preserve">— Yoshinori!</w:t>
       </w:r>
     </w:p>
     <w:p>
-      <w:pPr>
-        <w:ind w:firstLine="0"/>
-      </w:pPr>
       <w:r>
         <w:t xml:space="preserve">— Mas a Mônica é bonita. A Mônica é a mais forte da turma. — Ele se abaixou na minha altura e apertou minhas bochechas com uma mão só, como a família inteira fazia, como se elas fossem de massinha. — E tem as bochechas iguais.</w:t>
       </w:r>
@@ -134,12 +183,13 @@
     </w:p>
     <w:p>
       <w:pPr>
-        <w:spacing w:before="240" w:after="240"/>
+        <w:keepNext/>
+        <w:spacing w:before="200" w:after="200"/>
         <w:ind w:firstLine="0"/>
         <w:jc w:val="center"/>
       </w:pPr>
       <w:r>
-        <w:t xml:space="preserve">*</w:t>
+        <w:t xml:space="preserve">*   *   *</w:t>
       </w:r>
     </w:p>
     <w:p>
@@ -152,34 +202,25 @@
     </w:p>
     <w:p>
       <w:r>
-        <w:t xml:space="preserve">Minha mãe já estava pronta desde as seis. Tinha passado o vestido na noite anterior, depois da franja, e ele estava pendurado na porta do guarda-roupa num cabide só dele, como um convidado. Era branco, com três camadas de renda e uma saia armada por dentro com um tule que pinicava a perna. As mangas eram bufantes. Tudo nele era bufante. Minha mãe tinha visto um igual na vitrine de uma loja do centro e comprado o tecido para a costureira da rua de trás fazer, porque o da vitrine custava o que ela chamava de um absurdo.</w:t>
+        <w:t xml:space="preserve">Minha mãe já estava pronta desde as seis. O vestido estava pendurado na porta do guarda-roupa num cabide só dele, como um convidado. Era branco, com três camadas de renda e uma saia armada por dentro com um tule que pinicava a perna. As mangas eram bufantes. Tudo nele era bufante. Minha mãe tinha visto um igual na vitrine de uma loja do centro e comprado o tecido para a costureira da rua de trás fazer, porque o da vitrine custava o que ela chamava de um absurdo.</w:t>
       </w:r>
     </w:p>
     <w:p>
-      <w:pPr>
-        <w:ind w:firstLine="0"/>
-      </w:pPr>
       <w:r>
         <w:t xml:space="preserve">— Por que não vai?</w:t>
       </w:r>
     </w:p>
     <w:p>
-      <w:pPr>
-        <w:ind w:firstLine="0"/>
-      </w:pPr>
       <w:r>
         <w:t xml:space="preserve">Apontei para a testa.</w:t>
       </w:r>
     </w:p>
     <w:p>
       <w:r>
-        <w:t xml:space="preserve">Minha mãe sentou do meu lado na cama. Eu esperava que ela brigasse, ou que dissesse que eu estava linda, que era o que as mães diziam. Ela fez outra coisa. Molhou a mão na boca e tentou baixar a franja, puxando os fios para os olhos, como se desse para esticar cabelo. Não deu. Ela suspirou.</w:t>
+        <w:t xml:space="preserve">Minha mãe sentou do meu lado na cama. Eu esperava que ela brigasse, ou que dissesse que eu estava linda, que era o que as mães diziam. Ela molhou a mão na boca e tentou baixar a franja, puxando os fios para os olhos, como se desse para esticar cabelo. Não deu. Ela suspirou.</w:t>
       </w:r>
     </w:p>
     <w:p>
-      <w:pPr>
-        <w:ind w:firstLine="0"/>
-      </w:pPr>
       <w:r>
         <w:t xml:space="preserve">— Filha, ninguém vai olhar para a sua franja. Vão olhar para o vestido.</w:t>
       </w:r>
@@ -190,17 +231,11 @@
       </w:r>
     </w:p>
     <w:p>
-      <w:pPr>
-        <w:ind w:firstLine="0"/>
-      </w:pPr>
       <w:r>
         <w:t xml:space="preserve">— E a foto?</w:t>
       </w:r>
     </w:p>
     <w:p>
-      <w:pPr>
-        <w:ind w:firstLine="0"/>
-      </w:pPr>
       <w:r>
         <w:t xml:space="preserve">— A foto vai ficar linda. A gente paga a foto, você sorri, pronto.</w:t>
       </w:r>
@@ -216,9 +251,6 @@
       </w:r>
     </w:p>
     <w:p>
-      <w:pPr>
-        <w:ind w:firstLine="0"/>
-      </w:pPr>
       <w:r>
         <w:t xml:space="preserve">— Pronto — disse minha mãe, e me virou para o espelho.</w:t>
       </w:r>
@@ -235,7 +267,26 @@
     </w:p>
     <w:p>
       <w:pPr>
-        <w:pageBreakBefore/>
+        <w:spacing w:before="0" w:after="0" w:line="20" w:lineRule="exact"/>
+        <w:ind w:firstLine="0"/>
+        <w:sectPr>
+          <w:headerReference w:type="even" r:id="rId9"/>
+          <w:headerReference w:type="default" r:id="rIdHCap1"/>
+          <w:headerReference w:type="first" r:id="rIdHVazio"/>
+          <w:footerReference w:type="even" r:id="rId10"/>
+          <w:footerReference w:type="default" r:id="rId10"/>
+          <w:footerReference w:type="first" r:id="rId10"/>
+          <w:type w:val="nextPage"/>
+          <w:pgSz w:w="7920" w:h="12240"/>
+          <w:pgMar w:top="1000" w:right="870" w:bottom="1000" w:left="1150" w:header="560" w:footer="560" w:gutter="0"/>
+          <w:cols w:space="720"/>
+          <w:titlePg/>
+          <w:docGrid w:linePitch="360"/>
+        </w:sectPr>
+      </w:pPr>
+    </w:p>
+    <w:p>
+      <w:pPr>
         <w:spacing w:before="0" w:after="0"/>
         <w:ind w:firstLine="0"/>
       </w:pPr>
@@ -285,7 +336,7 @@
     </w:p>
     <w:p>
       <w:pPr>
-        <w:spacing w:before="900" w:after="0" w:line="934" w:lineRule="exact"/>
+        <w:spacing w:before="900" w:after="0" w:line="940" w:lineRule="exact"/>
         <w:ind w:firstLine="0"/>
         <w:jc w:val="left"/>
       </w:pPr>
@@ -294,8 +345,8 @@
           <w:rFonts w:ascii="Bebas Neue" w:hAnsi="Bebas Neue" w:cs="Bebas Neue"/>
           <w:caps/>
           <w:color w:val="A9A9A4"/>
-          <w:sz w:val="90"/>
-          <w:szCs w:val="90"/>
+          <w:sz w:val="92"/>
+          <w:szCs w:val="92"/>
         </w:rPr>
         <w:t xml:space="preserve">FILHA, NINGUÉM VAI OLHAR PARA A </w:t>
       </w:r>
@@ -304,8 +355,8 @@
           <w:rFonts w:ascii="Bebas Neue" w:hAnsi="Bebas Neue" w:cs="Bebas Neue"/>
           <w:caps/>
           <w:color w:val="FFFFFF"/>
-          <w:sz w:val="90"/>
-          <w:szCs w:val="90"/>
+          <w:sz w:val="92"/>
+          <w:szCs w:val="92"/>
         </w:rPr>
         <w:t xml:space="preserve">SUA FRANJA</w:t>
       </w:r>
@@ -314,8 +365,8 @@
           <w:rFonts w:ascii="Bebas Neue" w:hAnsi="Bebas Neue" w:cs="Bebas Neue"/>
           <w:caps/>
           <w:color w:val="A9A9A4"/>
-          <w:sz w:val="90"/>
-          <w:szCs w:val="90"/>
+          <w:sz w:val="92"/>
+          <w:szCs w:val="92"/>
         </w:rPr>
         <w:t xml:space="preserve">. VÃO OLHAR PARA O VESTIDO.</w:t>
       </w:r>
@@ -338,18 +389,33 @@
       </w:r>
     </w:p>
     <w:p>
-      <w:r>
-        <w:br w:type="page"/>
-      </w:r>
+      <w:pPr>
+        <w:spacing w:before="0" w:after="0" w:line="20" w:lineRule="exact"/>
+        <w:ind w:firstLine="0"/>
+        <w:sectPr>
+          <w:headerReference w:type="even" r:id="rIdHVazio"/>
+          <w:headerReference w:type="default" r:id="rIdHVazio"/>
+          <w:headerReference w:type="first" r:id="rIdHVazio"/>
+          <w:footerReference w:type="even" r:id="rIdFVazio"/>
+          <w:footerReference w:type="default" r:id="rIdFVazio"/>
+          <w:footerReference w:type="first" r:id="rIdFVazio"/>
+          <w:type w:val="nextPage"/>
+          <w:pgSz w:w="7920" w:h="12240"/>
+          <w:pgMar w:top="1000" w:right="870" w:bottom="1000" w:left="1150" w:header="560" w:footer="560" w:gutter="0"/>
+          <w:cols w:space="720"/>
+          <w:docGrid w:linePitch="360"/>
+        </w:sectPr>
+      </w:pPr>
     </w:p>
     <w:p>
       <w:pPr>
-        <w:spacing w:before="240" w:after="240"/>
+        <w:keepNext/>
+        <w:spacing w:before="200" w:after="200"/>
         <w:ind w:firstLine="0"/>
         <w:jc w:val="center"/>
       </w:pPr>
       <w:r>
-        <w:t xml:space="preserve">*</w:t>
+        <w:t xml:space="preserve">*   *   *</w:t>
       </w:r>
     </w:p>
     <w:p>
@@ -367,12 +433,12 @@
     </w:p>
     <w:p>
       <w:r>
-        <w:t xml:space="preserve">Via, por exemplo, que o Rodrigo tinha chorado no carro, porque os olhos ainda estavam inchados e a mãe dele não largava a mão dele por nada. Que a Fabiana estava de sapato novo e andava esquisito, com medo de sujar. Que as meninas mais bonitas da sala tinham ido ao salão, e que nenhuma delas tinha franja. Eram os mesmos amigos com quem eu tinha passado o ano colando macarrão em cartolina. Alguns iam ficar comigo muitos anos. Naquele dia, eu não sabia disso; só sabia que, de roupa de festa, eles pareciam outras pessoas, e que eu também devia parecer.</w:t>
+        <w:t xml:space="preserve">Via que o Rodrigo tinha chorado no carro, porque os olhos ainda estavam inchados e a mãe dele não largava a mão dele por nada. Que a Fabiana estava de sapato novo e andava esquisito, com medo de sujar. Que as meninas mais bonitas da sala tinham ido ao salão, e que nenhuma delas tinha franja.</w:t>
       </w:r>
     </w:p>
     <w:p>
       <w:r>
-        <w:t xml:space="preserve">Do outro lado do pátio ficava o prédio do primário, de dois andares, com as janelas altas e as grades verdes. No ano seguinte eu ia subir aquela escada. Tinha ouvido falar que na primeira série não tinha mais massinha nem soninho depois do lanche, que a professora passava lição no quadro e que quem não copiasse a tempo ficava sem recreio. Tinha ouvido falar também de uma prova, uma coisa que eu nunca tinha visto e que imaginava como uma porta que se fechava na cara de quem errasse.</w:t>
+        <w:t xml:space="preserve">Do outro lado do pátio ficava o prédio do primário, de dois andares, com as janelas altas e as grades verdes. No ano seguinte eu ia subir aquela escada. Tinha ouvido falar que na primeira série não tinha mais massinha nem soninho depois do lanche, que quem não copiasse a lição a tempo ficava sem recreio, e que havia uma prova, uma coisa que eu nunca tinha visto e que imaginava como uma porta que se fechava na cara de quem errasse.</w:t>
       </w:r>
     </w:p>
     <w:p>
@@ -381,30 +447,21 @@
       </w:r>
     </w:p>
     <w:p>
-      <w:pPr>
-        <w:ind w:firstLine="0"/>
-      </w:pPr>
       <w:r>
         <w:t xml:space="preserve">— Crianças, fila para a foto! Os baixinhos na frente!</w:t>
       </w:r>
     </w:p>
     <w:p>
-      <w:pPr>
-        <w:ind w:firstLine="0"/>
-      </w:pPr>
       <w:r>
         <w:t xml:space="preserve">Fui para a frente. Eu era sempre dos baixinhos.</w:t>
       </w:r>
     </w:p>
     <w:p>
       <w:r>
-        <w:t xml:space="preserve">O fotógrafo era um homem de colete cheio de bolsos, suando, com uma câmera enorme num tripé e um guarda-chuva prateado ao lado. Ele se abaixava atrás da câmera, cobria meio rosto com a mão e voltava a aparecer, reclamando do sol. A tia Márcia ia ajeitando um por um: laço, gola, cabelo atrás da orelha. Quando chegou em mim, parou. Olhou para a franja. Pensou um pouco. Não mexeu em nada.</w:t>
+        <w:t xml:space="preserve">O fotógrafo era um homem de colete cheio de bolsos, suando, com uma câmera enorme num tripé e um guarda-chuva prateado ao lado. A tia Márcia ia ajeitando um por um: laço, gola, cabelo atrás da orelha. Quando chegou em mim, parou. Olhou para a franja. Pensou um pouco. Não mexeu em nada.</w:t>
       </w:r>
     </w:p>
     <w:p>
-      <w:pPr>
-        <w:ind w:firstLine="0"/>
-      </w:pPr>
       <w:r>
         <w:t xml:space="preserve">— Tá linda — disse, e seguiu para o próximo.</w:t>
       </w:r>
@@ -415,9 +472,6 @@
       </w:r>
     </w:p>
     <w:p>
-      <w:pPr>
-        <w:ind w:firstLine="0"/>
-      </w:pPr>
       <w:r>
         <w:t xml:space="preserve">— Olha o passarinho! Todo mundo sorrindo!</w:t>
       </w:r>
@@ -428,9 +482,6 @@
       </w:r>
     </w:p>
     <w:p>
-      <w:pPr>
-        <w:ind w:firstLine="0"/>
-      </w:pPr>
       <w:r>
         <w:t xml:space="preserve">E sorri.</w:t>
       </w:r>
@@ -446,32 +497,81 @@
       </w:r>
     </w:p>
     <w:p>
+      <w:pPr>
+        <w:spacing w:before="0" w:after="0" w:line="20" w:lineRule="exact"/>
+        <w:ind w:firstLine="0"/>
+        <w:sectPr>
+          <w:headerReference w:type="even" r:id="rId9"/>
+          <w:headerReference w:type="default" r:id="rIdHCap1"/>
+          <w:headerReference w:type="first" r:id="rIdHVazio"/>
+          <w:footerReference w:type="even" r:id="rId10"/>
+          <w:footerReference w:type="default" r:id="rId10"/>
+          <w:footerReference w:type="first" r:id="rId10"/>
+          <w:type w:val="nextPage"/>
+          <w:pgSz w:w="7920" w:h="12240"/>
+          <w:pgMar w:top="1000" w:right="870" w:bottom="1000" w:left="1150" w:header="560" w:footer="560" w:gutter="0"/>
+          <w:cols w:space="720"/>
+          <w:docGrid w:linePitch="360"/>
+        </w:sectPr>
+      </w:pPr>
+    </w:p>
+    <w:p>
+      <w:pPr>
+        <w:keepNext/>
+        <w:spacing w:before="1500" w:after="160" w:line="240" w:lineRule="auto"/>
+        <w:ind w:firstLine="0"/>
+        <w:jc w:val="center"/>
+      </w:pPr>
       <w:r>
-        <w:br w:type="page"/>
+        <w:rPr>
+          <w:rFonts w:ascii="EB Garamond" w:hAnsi="EB Garamond"/>
+          <w:color w:val="555555"/>
+          <w:spacing w:val="40"/>
+          <w:sz w:val="19"/>
+          <w:szCs w:val="19"/>
+        </w:rPr>
+        <w:t xml:space="preserve">CAPÍTULO 2</w:t>
       </w:r>
     </w:p>
     <w:p>
       <w:pPr>
-        <w:pStyle w:val="MyChapterTitle"/>
-        <w:spacing w:before="1440" w:after="560"/>
+        <w:keepNext/>
+        <w:spacing w:before="0" w:after="900" w:line="240" w:lineRule="auto"/>
+        <w:ind w:firstLine="0"/>
+        <w:jc w:val="center"/>
       </w:pPr>
       <w:r>
-        <w:t xml:space="preserve">CAPÍTULO 2 — O NAVIO E OS DOZE</w:t>
+        <w:rPr>
+          <w:rFonts w:ascii="EB Garamond" w:hAnsi="EB Garamond"/>
+          <w:spacing w:val="10"/>
+          <w:sz w:val="34"/>
+          <w:szCs w:val="34"/>
+        </w:rPr>
+        <w:t xml:space="preserve">O NAVIO E OS DOZE</w:t>
+      </w:r>
+    </w:p>
+    <w:p>
+      <w:pPr>
+        <w:ind w:firstLine="0"/>
+      </w:pPr>
+      <w:r>
+        <w:rPr>
+          <w:smallCaps/>
+        </w:rPr>
+        <w:t xml:space="preserve">A família da minha</w:t>
+      </w:r>
+      <w:r>
+        <w:t xml:space="preserve"> mãe se reunia no primeiro dia do ano, e ninguém nunca conseguiu contar direito quantas pessoas cabiam naquela casa.</w:t>
       </w:r>
     </w:p>
     <w:p>
       <w:r>
-        <w:t xml:space="preserve">A família da minha mãe se reunia no primeiro dia do ano, e ninguém nunca conseguiu contar direito quantas pessoas cabiam naquela casa.</w:t>
+        <w:t xml:space="preserve">Eram doze irmãos. Isso todo mundo dizia com orgulho, do jeito que se diz o tamanho de um peixe: doze. Eu passava o almoço inteiro tentando fazer a conta bater. Contava os tios na mesa comprida da garagem, os que estavam na cozinha, o que tinha ido buscar gelo, a tia que chegava sempre atrasada com um pudim no colo. Contava nos dedos, perdia, recomeçava. Nunca chegava a doze.</w:t>
       </w:r>
     </w:p>
     <w:p>
       <w:r>
-        <w:t xml:space="preserve">Eram doze irmãos. Isso todo mundo dizia com orgulho, do jeito que se diz o tamanho de um peixe: doze. Na minha cabeça de criança, doze irmãos era uma coisa de desenho animado, uma escadinha de cabeças pretas enfileiradas numa foto, e eu passava o almoço inteiro tentando fazer a conta bater. Contava os tios na mesa comprida da garagem, os que estavam na cozinha, o que tinha ido buscar gelo, a tia que chegava sempre atrasada com um pudim no colo. Contava nos dedos, perdia, recomeçava. Nunca chegava a doze.</w:t>
-      </w:r>
-    </w:p>
-    <w:p>
-      <w:r>
-        <w:t xml:space="preserve">A mesa era uma mistura que eu achava normal e que só muito depois descobri que não era de todo mundo. Tinha norimaki cortado em rodelas, com o pepino e o ovo aparecendo no meio, ao lado de uma travessa de maionese de batata e de um pernil que alguém tinha assado de madrugada. Tinha arroz de dois tipos, o branco e o de feijão. Tinha nishime, os legumes cozidos no shoyu, que nenhuma criança comia e que todo ano aparecia, e um pavê que todas as crianças comiam antes da hora. Os adultos falavam português misturado com japonês, e o japonês aparecia sempre que o assunto era sério ou quando alguém queria falar mal de alguém sem que as crianças entendessem. A gente entendia. Pelo menos o tom.</w:t>
+        <w:t xml:space="preserve">A mesa era uma mistura que eu achava normal e que só muito depois descobri que não era de todo mundo. Tinha norimaki cortado em rodelas ao lado de uma travessa de maionese de batata e de um pernil que alguém tinha assado de madrugada. Tinha nishime, os legumes cozidos no shoyu, que nenhuma criança comia e que todo ano aparecia, e um pavê que todas as crianças comiam antes da hora. Os adultos falavam português misturado com japonês, e o japonês aparecia sempre que o assunto era sério ou quando alguém queria falar mal de alguém sem que as crianças entendessem. A gente entendia. Pelo menos o tom.</w:t>
       </w:r>
     </w:p>
     <w:p>
@@ -490,132 +590,94 @@
       </w:r>
     </w:p>
     <w:p>
-      <w:pPr>
-        <w:ind w:firstLine="0"/>
-      </w:pPr>
       <w:r>
         <w:t xml:space="preserve">— Mais de um mês de mar — dizia, e levantava o copo de cerveja, como se o mar estivesse ali dentro. — Mais de um mês.</w:t>
       </w:r>
     </w:p>
     <w:p>
       <w:r>
-        <w:t xml:space="preserve">As crianças se juntavam em volta dele. Os tios não; os tios já tinham ouvido. Ele contava do navio, do cheiro de óleo nos corredores de baixo, das pessoas enjoando nas redes e nos beliches, dele mesmo vomitando "até a África", e da primeira vez que viu o porto de Santos, com um calor que ele nunca tinha imaginado que existisse. Cada ano a história tinha um detalhe diferente. Num ano havia uma tempestade; no outro, uma baleia. Eu não sabia o que era verdade e não me importava. Eu achava bonito que alguém tivesse atravessado o mundo inteiro para vir parar ali, naquela garagem, entre o pernil e o pavê.</w:t>
+        <w:t xml:space="preserve">As crianças se juntavam em volta dele. Os tios não; os tios já tinham ouvido. Ele contava do navio, do cheiro de óleo nos corredores de baixo, dele mesmo vomitando "até a África", e da primeira vez que viu o porto de Santos, com um calor que ele nunca tinha imaginado que existisse. Cada ano a história tinha um detalhe diferente. Num ano havia uma tempestade; no outro, uma baleia. Eu não sabia o que era verdade e não me importava. Achava bonito que alguém tivesse atravessado o mundo inteiro para vir parar ali, naquela garagem, entre o pernil e o pavê.</w:t>
       </w:r>
     </w:p>
     <w:p>
-      <w:pPr>
-        <w:ind w:firstLine="0"/>
-      </w:pPr>
       <w:r>
         <w:t xml:space="preserve">— E o vô? — perguntou um primo meu, mais velho. — É verdade que ele pilotava avião na guerra?</w:t>
       </w:r>
     </w:p>
     <w:p>
-      <w:pPr>
-        <w:ind w:firstLine="0"/>
-      </w:pPr>
       <w:r>
         <w:t xml:space="preserve">Meu pai demorou um pouco mais para responder essa.</w:t>
       </w:r>
     </w:p>
     <w:p>
-      <w:pPr>
-        <w:ind w:firstLine="0"/>
-      </w:pPr>
       <w:r>
         <w:t xml:space="preserve">— Pilotava.</w:t>
       </w:r>
     </w:p>
     <w:p>
-      <w:pPr>
-        <w:ind w:firstLine="0"/>
-      </w:pPr>
       <w:r>
         <w:t xml:space="preserve">— Ele matou gente?</w:t>
       </w:r>
     </w:p>
     <w:p>
-      <w:pPr>
-        <w:ind w:firstLine="0"/>
-      </w:pPr>
       <w:r>
         <w:t xml:space="preserve">— Lucas! — gritou uma tia, da cozinha.</w:t>
       </w:r>
     </w:p>
     <w:p>
-      <w:pPr>
-        <w:ind w:firstLine="0"/>
-      </w:pPr>
       <w:r>
         <w:t xml:space="preserve">— Ele não falava disso — disse meu pai. E, antes que alguém perguntasse mais, virou a cerveja e mudou de avião para navio, de navio para baleia, e a baleia daquele ano ficou maior.</w:t>
       </w:r>
     </w:p>
     <w:p>
-      <w:pPr>
-        <w:ind w:firstLine="0"/>
-      </w:pPr>
       <w:r>
-        <w:t xml:space="preserve">Da minha avó, a mãe dele, eu conhecia só uma foto em preto e branco, num porta-retratos em cima da televisão lá de casa. Ela tinha morrido antes de eu nascer. Na foto, era uma moça de cabelo preso e boca pintada, séria, com um rosto que eu achava bonito demais para ser de avó. Meu pai dizia que ela tocava qualquer instrumento que pusessem na mão dela. Contava isso fingindo dedilhar alguma coisa no ar, com os olhos fechados, e depois abria um olho só e completava:</w:t>
+        <w:t xml:space="preserve">Da minha avó, a mãe dele, eu conhecia só uma foto em preto e branco, num porta-retratos em cima da televisão lá de casa. Na foto, era uma moça de cabelo preso e boca pintada, séria, com um rosto que eu achava bonito demais para ser de avó. Meu pai dizia que ela tocava qualquer instrumento que pusessem na mão dela. Contava isso fingindo dedilhar alguma coisa no ar, com os olhos fechados, e depois abria um olho só e completava:</w:t>
       </w:r>
     </w:p>
     <w:p>
-      <w:pPr>
-        <w:ind w:firstLine="0"/>
-      </w:pPr>
       <w:r>
         <w:t xml:space="preserve">— E gostava de uma cervejinha.</w:t>
       </w:r>
     </w:p>
     <w:p>
       <w:r>
-        <w:t xml:space="preserve">Naquele almoço, enquanto ele contava, eu me aproximei do copo dele, que estava na beira da mesa, e enfiei o dedo na espuma. Ninguém viu, só ele. Lambi o dedo. Era amargo e horrível, e eu fiz uma careta tão grande que ele gargalhou.</w:t>
+        <w:t xml:space="preserve">Naquele almoço, enquanto ele contava, eu enfiei o dedo na espuma do copo dele, que estava na beira da mesa. Ninguém viu, só ele. Lambi o dedo. Era amargo e horrível, e eu fiz uma careta tão grande que ele gargalhou.</w:t>
       </w:r>
     </w:p>
     <w:p>
-      <w:pPr>
-        <w:ind w:firstLine="0"/>
-      </w:pPr>
       <w:r>
         <w:t xml:space="preserve">— Puxou a minha mãe!</w:t>
       </w:r>
     </w:p>
     <w:p>
-      <w:pPr>
-        <w:ind w:firstLine="0"/>
-      </w:pPr>
       <w:r>
         <w:t xml:space="preserve">— Yoshinori! — Minha mãe apareceu na porta da cozinha, com um pano de prato no ombro. — Não fala uma coisa dessas.</w:t>
       </w:r>
     </w:p>
     <w:p>
-      <w:pPr>
-        <w:ind w:firstLine="0"/>
-      </w:pPr>
       <w:r>
         <w:t xml:space="preserve">— Estou brincando, Nair.</w:t>
       </w:r>
     </w:p>
     <w:p>
-      <w:pPr>
-        <w:ind w:firstLine="0"/>
-      </w:pPr>
       <w:r>
         <w:t xml:space="preserve">— Não brinca com isso.</w:t>
       </w:r>
     </w:p>
     <w:p>
       <w:r>
-        <w:t xml:space="preserve">Ela voltou para dentro. Meu pai piscou para mim, e eu ri, porque ele queria que eu risse. Mas fiquei olhando a porta da cozinha por onde minha mãe tinha sumido, com uma sensação de que alguma coisa tinha sido dita por baixo da coisa dita. Eu tinha sete anos. Não sabia o nome disso, mas conhecia muito bem a sensação.</w:t>
+        <w:t xml:space="preserve">Ela voltou para dentro. Meu pai piscou para mim, e eu ri, porque ele queria que eu risse. Mas fiquei olhando a porta da cozinha por onde minha mãe tinha sumido, com a sensação de que alguma coisa tinha sido dita por baixo da coisa dita. Eu tinha sete anos. Não sabia o nome disso, mas conhecia muito bem a sensação.</w:t>
       </w:r>
     </w:p>
     <w:p>
       <w:pPr>
-        <w:spacing w:before="240" w:after="240"/>
+        <w:keepNext/>
+        <w:spacing w:before="200" w:after="200"/>
         <w:ind w:firstLine="0"/>
         <w:jc w:val="center"/>
       </w:pPr>
       <w:r>
-        <w:t xml:space="preserve">*</w:t>
+        <w:t xml:space="preserve">*   *   *</w:t>
       </w:r>
     </w:p>
     <w:p>
@@ -637,25 +699,16 @@
       </w:r>
     </w:p>
     <w:p>
-      <w:pPr>
-        <w:ind w:firstLine="0"/>
-      </w:pPr>
       <w:r>
         <w:t xml:space="preserve">— Tia — perguntei à que estava mais perto, a que enxugava. — Por que não dá doze?</w:t>
       </w:r>
     </w:p>
     <w:p>
-      <w:pPr>
-        <w:ind w:firstLine="0"/>
-      </w:pPr>
       <w:r>
         <w:t xml:space="preserve">— Doze o quê?</w:t>
       </w:r>
     </w:p>
     <w:p>
-      <w:pPr>
-        <w:ind w:firstLine="0"/>
-      </w:pPr>
       <w:r>
         <w:t xml:space="preserve">— Os irmãos. Eu contei e não dá.</w:t>
       </w:r>
@@ -666,9 +719,6 @@
       </w:r>
     </w:p>
     <w:p>
-      <w:pPr>
-        <w:ind w:firstLine="0"/>
-      </w:pPr>
       <w:r>
         <w:t xml:space="preserve">— A mãe teve doze — disse a tia, e pegou outro prato. — Criou oito. Os gêmeos nasceram e já foram, no mesmo dia. Depois foram mais dois, ainda pequenos. Era assim naquele tempo. — Estendeu a mão para a irmã da pia. — Me passa o detergente.</w:t>
       </w:r>
@@ -685,7 +735,7 @@
     </w:p>
     <w:p>
       <w:r>
-        <w:t xml:space="preserve">Da garagem vinha o barulho do karaokê que um tio tinha ligado, e depois a voz do meu pai, alta, afinada, cantando uma música japonesa antiga que fazia as tias mais velhas pararem de conversar para ouvir. Ele cantava de olhos fechados, eu sabia sem precisar ver. Minha mãe não foi olhar.</w:t>
+        <w:t xml:space="preserve">Da garagem vinha o barulho do karaokê que um tio tinha ligado, e depois a voz do meu pai, alta, afinada, cantando uma música japonesa antiga que fazia as tias mais velhas pararem de conversar para ouvir. Minha mãe não foi olhar.</w:t>
       </w:r>
     </w:p>
     <w:p>
@@ -699,27 +749,77 @@
       </w:r>
     </w:p>
     <w:p>
+      <w:pPr>
+        <w:spacing w:before="0" w:after="0" w:line="20" w:lineRule="exact"/>
+        <w:ind w:firstLine="0"/>
+        <w:sectPr>
+          <w:headerReference w:type="even" r:id="rId9"/>
+          <w:headerReference w:type="default" r:id="rIdHCap2"/>
+          <w:headerReference w:type="first" r:id="rIdHVazio"/>
+          <w:footerReference w:type="even" r:id="rId10"/>
+          <w:footerReference w:type="default" r:id="rId10"/>
+          <w:footerReference w:type="first" r:id="rId10"/>
+          <w:type w:val="nextPage"/>
+          <w:pgSz w:w="7920" w:h="12240"/>
+          <w:pgMar w:top="1000" w:right="870" w:bottom="1000" w:left="1150" w:header="560" w:footer="560" w:gutter="0"/>
+          <w:cols w:space="720"/>
+          <w:titlePg/>
+          <w:docGrid w:linePitch="360"/>
+        </w:sectPr>
+      </w:pPr>
+    </w:p>
+    <w:p>
+      <w:pPr>
+        <w:keepNext/>
+        <w:spacing w:before="1500" w:after="160" w:line="240" w:lineRule="auto"/>
+        <w:ind w:firstLine="0"/>
+        <w:jc w:val="center"/>
+      </w:pPr>
       <w:r>
-        <w:br w:type="page"/>
+        <w:rPr>
+          <w:rFonts w:ascii="EB Garamond" w:hAnsi="EB Garamond"/>
+          <w:color w:val="555555"/>
+          <w:spacing w:val="40"/>
+          <w:sz w:val="19"/>
+          <w:szCs w:val="19"/>
+        </w:rPr>
+        <w:t xml:space="preserve">CAPÍTULO 3</w:t>
       </w:r>
     </w:p>
     <w:p>
       <w:pPr>
-        <w:pStyle w:val="MyChapterTitle"/>
-        <w:spacing w:before="1440" w:after="560"/>
+        <w:keepNext/>
+        <w:spacing w:before="0" w:after="900" w:line="240" w:lineRule="auto"/>
+        <w:ind w:firstLine="0"/>
+        <w:jc w:val="center"/>
       </w:pPr>
       <w:r>
-        <w:t xml:space="preserve">CAPÍTULO 3 — O CAMALEÃO</w:t>
+        <w:rPr>
+          <w:rFonts w:ascii="EB Garamond" w:hAnsi="EB Garamond"/>
+          <w:spacing w:val="10"/>
+          <w:sz w:val="34"/>
+          <w:szCs w:val="34"/>
+        </w:rPr>
+        <w:t xml:space="preserve">O CAMALEÃO</w:t>
+      </w:r>
+    </w:p>
+    <w:p>
+      <w:pPr>
+        <w:ind w:firstLine="0"/>
+      </w:pPr>
+      <w:r>
+        <w:rPr>
+          <w:smallCaps/>
+        </w:rPr>
+        <w:t xml:space="preserve">Na primeira série descobri</w:t>
+      </w:r>
+      <w:r>
+        <w:t xml:space="preserve"> que eu era boa numa coisa que não tinha nota.</w:t>
       </w:r>
     </w:p>
     <w:p>
       <w:r>
-        <w:t xml:space="preserve">Na primeira série descobri que eu era boa numa coisa que não tinha nota.</w:t>
-      </w:r>
-    </w:p>
-    <w:p>
-      <w:r>
-        <w:t xml:space="preserve">A escada do prédio grande era menos alta do que parecia do pátio. A professora passava a lição no quadro, sim, e quem não copiava a tempo ficava sem recreio, mas eu copiava a tempo. A prova, quando chegou, era uma folha mimeografada, roxa e com cheiro de álcool, e não uma porta. Eu tirei nove. Guardei a folha dentro do caderno e levei para casa como quem leva um bicho ferido, com cuidado para não amassar.</w:t>
+        <w:t xml:space="preserve">A escada do prédio grande era menos alta do que parecia do pátio. A professora passava a lição no quadro, sim, e quem não copiava a tempo ficava sem recreio, mas eu copiava a tempo. A prova, quando chegou, era uma folha mimeografada, roxa e com cheiro de álcool, e não uma porta. Eu tirei nove. Levei a folha para casa dentro do caderno como quem leva um bicho ferido, com cuidado para não amassar.</w:t>
       </w:r>
     </w:p>
     <w:p>
@@ -729,13 +829,10 @@
     </w:p>
     <w:p>
       <w:r>
-        <w:t xml:space="preserve">Na minha sala, como em todas as salas do mundo, as crianças foram se separando sozinhas, sem ninguém mandar, como feijão e pedrinha na peneira. Tinha a turma da Renata, que morava numa casa com piscina e trazia lanche de padaria em vez de pão com margarina, e que dava as festas de aniversário mais disputadas da série. Tinha o Thiago e os amigos dele, que sabiam a tabuada do nove de trás para frente e corrigiam a professora quando ela errava uma conta no quadro. Tinha o Marcão, que era um ano mais velho porque tinha repetido, e a turma dele, que passava o recreio inteiro correndo e voltava para a sala vermelha e fedida. E tinha a Érica, que falava tão baixo que a professora pedia para ela repetir três vezes, e as duas ou três meninas que sentavam perto dela e desenhavam cavalos na última folha do caderno.</w:t>
+        <w:t xml:space="preserve">Na minha sala, como em todas as salas do mundo, as crianças foram se separando sozinhas, como feijão e pedrinha na peneira. Tinha a turma da Renata, que morava numa casa com piscina, trazia lanche de padaria e dava as festas de aniversário mais disputadas da série. Tinha o Thiago e os amigos dele, que sabiam a tabuada do nove de trás para frente e corrigiam a professora quando ela errava uma conta no quadro. Tinha o Marcão, que era um ano mais velho porque tinha repetido, e a turma dele, que passava o recreio inteiro correndo e voltava para a sala vermelha e fedida. E tinha a Érica, que falava tão baixo que a professora pedia para ela repetir três vezes, e as duas ou três meninas que sentavam perto dela e desenhavam cavalos na última folha do caderno.</w:t>
       </w:r>
     </w:p>
     <w:p>
-      <w:pPr>
-        <w:ind w:firstLine="0"/>
-      </w:pPr>
       <w:r>
         <w:t xml:space="preserve">Eu andava entre todos.</w:t>
       </w:r>
@@ -752,18 +849,15 @@
     </w:p>
     <w:p>
       <w:r>
-        <w:t xml:space="preserve">Isso parecia um talento, e era. A professora escreveu no meu boletim da terceira série, no espaço de observações, com letra redonda: "Aluna muito sociável, se dá bem com todos os colegas." Minha mãe leu em voz alta na cozinha, duas vezes, depois levou o boletim para mostrar às clientes da ótica e, à noite, pendurou na porta da geladeira com um ímã de banana.</w:t>
+        <w:t xml:space="preserve">Isso parecia um talento, e era. A professora escreveu no meu boletim da terceira série, no espaço de observações, com letra redonda: "Aluna muito sociável, se dá bem com todos os colegas." Minha mãe leu em voz alta na cozinha, duas vezes, levou o boletim para mostrar às clientes da ótica e, à noite, pendurou na porta da geladeira com um ímã de banana.</w:t>
       </w:r>
     </w:p>
     <w:p>
       <w:r>
-        <w:t xml:space="preserve">À noite, falando ao telefone com uma das irmãs, com o fio esticado até a sala para poder sentar no sofá, ela disse uma frase que eu ouvi do corredor e que ficou.</w:t>
+        <w:t xml:space="preserve">Depois, falando ao telefone com uma das irmãs, com o fio esticado até a sala para poder sentar no sofá, ela disse uma frase que eu ouvi do corredor e que ficou.</w:t>
       </w:r>
     </w:p>
     <w:p>
-      <w:pPr>
-        <w:ind w:firstLine="0"/>
-      </w:pPr>
       <w:r>
         <w:t xml:space="preserve">— A Luciana? Essa não dá trabalho nenhum.</w:t>
       </w:r>
@@ -775,7 +869,26 @@
     </w:p>
     <w:p>
       <w:pPr>
-        <w:pageBreakBefore/>
+        <w:spacing w:before="0" w:after="0" w:line="20" w:lineRule="exact"/>
+        <w:ind w:firstLine="0"/>
+        <w:sectPr>
+          <w:headerReference w:type="even" r:id="rId9"/>
+          <w:headerReference w:type="default" r:id="rIdHCap3"/>
+          <w:headerReference w:type="first" r:id="rIdHVazio"/>
+          <w:footerReference w:type="even" r:id="rId10"/>
+          <w:footerReference w:type="default" r:id="rId10"/>
+          <w:footerReference w:type="first" r:id="rId10"/>
+          <w:type w:val="nextPage"/>
+          <w:pgSz w:w="7920" w:h="12240"/>
+          <w:pgMar w:top="1000" w:right="870" w:bottom="1000" w:left="1150" w:header="560" w:footer="560" w:gutter="0"/>
+          <w:cols w:space="720"/>
+          <w:titlePg/>
+          <w:docGrid w:linePitch="360"/>
+        </w:sectPr>
+      </w:pPr>
+    </w:p>
+    <w:p>
+      <w:pPr>
         <w:spacing w:before="0" w:after="0"/>
         <w:ind w:firstLine="0"/>
       </w:pPr>
@@ -825,7 +938,7 @@
     </w:p>
     <w:p>
       <w:pPr>
-        <w:spacing w:before="900" w:after="0" w:line="927" w:lineRule="exact"/>
+        <w:spacing w:before="900" w:after="0" w:line="933" w:lineRule="exact"/>
         <w:ind w:firstLine="0"/>
         <w:jc w:val="right"/>
       </w:pPr>
@@ -861,18 +974,33 @@
       </w:r>
     </w:p>
     <w:p>
-      <w:r>
-        <w:br w:type="page"/>
-      </w:r>
+      <w:pPr>
+        <w:spacing w:before="0" w:after="0" w:line="20" w:lineRule="exact"/>
+        <w:ind w:firstLine="0"/>
+        <w:sectPr>
+          <w:headerReference w:type="even" r:id="rIdHVazio"/>
+          <w:headerReference w:type="default" r:id="rIdHVazio"/>
+          <w:headerReference w:type="first" r:id="rIdHVazio"/>
+          <w:footerReference w:type="even" r:id="rIdFVazio"/>
+          <w:footerReference w:type="default" r:id="rIdFVazio"/>
+          <w:footerReference w:type="first" r:id="rIdFVazio"/>
+          <w:type w:val="nextPage"/>
+          <w:pgSz w:w="7920" w:h="12240"/>
+          <w:pgMar w:top="1000" w:right="870" w:bottom="1000" w:left="1150" w:header="560" w:footer="560" w:gutter="0"/>
+          <w:cols w:space="720"/>
+          <w:docGrid w:linePitch="360"/>
+        </w:sectPr>
+      </w:pPr>
     </w:p>
     <w:p>
       <w:pPr>
-        <w:spacing w:before="240" w:after="240"/>
+        <w:keepNext/>
+        <w:spacing w:before="200" w:after="200"/>
         <w:ind w:firstLine="0"/>
         <w:jc w:val="center"/>
       </w:pPr>
       <w:r>
-        <w:t xml:space="preserve">*</w:t>
+        <w:t xml:space="preserve">*   *   *</w:t>
       </w:r>
     </w:p>
     <w:p>
@@ -889,9 +1017,6 @@
       </w:r>
     </w:p>
     <w:p>
-      <w:pPr>
-        <w:ind w:firstLine="0"/>
-      </w:pPr>
       <w:r>
         <w:t xml:space="preserve">— E vocês mesmos vão escolher — disse ela, sorrindo, como se estivesse dando um presente. — Dois minutos. Levantem e se organizem.</w:t>
       </w:r>
@@ -902,40 +1027,28 @@
       </w:r>
     </w:p>
     <w:p>
-      <w:pPr>
-        <w:ind w:firstLine="0"/>
-      </w:pPr>
       <w:r>
         <w:t xml:space="preserve">Eu fiquei no meio da sala.</w:t>
       </w:r>
     </w:p>
     <w:p>
-      <w:pPr>
-        <w:ind w:firstLine="0"/>
-      </w:pPr>
       <w:r>
         <w:t xml:space="preserve">— Lu! — chamou a Renata, da janela. — Vem, falta uma.</w:t>
       </w:r>
     </w:p>
     <w:p>
-      <w:pPr>
-        <w:ind w:firstLine="0"/>
-      </w:pPr>
       <w:r>
         <w:t xml:space="preserve">— Luciana, vem pro vulcão — disse o Thiago, sem nem olhar, certo de que eu ia.</w:t>
       </w:r>
     </w:p>
     <w:p>
-      <w:pPr>
-        <w:ind w:firstLine="0"/>
-      </w:pPr>
       <w:r>
         <w:t xml:space="preserve">— Ô, japonesa! — gritou o Marcão, de cima da carteira. — Tá com a gente!</w:t>
       </w:r>
     </w:p>
     <w:p>
       <w:r>
-        <w:t xml:space="preserve">A Érica não chamou. Só olhou para mim, e depois olhou para a cadeira vazia do lado dela, e depois para o caderno de novo.</w:t>
+        <w:t xml:space="preserve">A Érica não chamou. Só olhou para mim, e depois para a cadeira vazia do lado dela, e depois para o caderno de novo.</w:t>
       </w:r>
     </w:p>
     <w:p>
@@ -949,17 +1062,11 @@
       </w:r>
     </w:p>
     <w:p>
-      <w:pPr>
-        <w:ind w:firstLine="0"/>
-      </w:pPr>
       <w:r>
         <w:t xml:space="preserve">— Luciana? — A dona Lourdes tinha visto. Todo mundo tinha visto. — Não escolheu?</w:t>
       </w:r>
     </w:p>
     <w:p>
-      <w:pPr>
-        <w:ind w:firstLine="0"/>
-      </w:pPr>
       <w:r>
         <w:t xml:space="preserve">— Tanto faz, professora.</w:t>
       </w:r>
@@ -970,16 +1077,13 @@
       </w:r>
     </w:p>
     <w:p>
-      <w:pPr>
-        <w:ind w:firstLine="0"/>
-      </w:pPr>
       <w:r>
         <w:t xml:space="preserve">— Então vai para onde falta gente. O grupo da Érica está com três.</w:t>
       </w:r>
     </w:p>
     <w:p>
       <w:r>
-        <w:t xml:space="preserve">Os outros grupos voltaram para as próprias discussões, aliviados ou indiferentes, e ninguém ficou bravo comigo. Ninguém tinha perdido nada. Eu não tinha escolhido, e por isso ninguém tinha sido trocado. Pareceu a solução perfeita. Eu atravessei a sala com o estojo na mão, sentindo nas costas o olhar de todo mundo, e sem saber direito se aquilo que eu sentia era alívio ou outra coisa.</w:t>
+        <w:t xml:space="preserve">Os outros grupos voltaram para as próprias discussões, e ninguém ficou bravo comigo. Ninguém tinha perdido nada. Eu não tinha escolhido, e por isso ninguém tinha sido trocado. Pareceu a solução perfeita. Atravessei a sala com o estojo na mão, sentindo nas costas o olhar de todo mundo, sem saber se aquilo que eu sentia era alívio ou outra coisa.</w:t>
       </w:r>
     </w:p>
     <w:p>
@@ -988,27 +1092,76 @@
       </w:r>
     </w:p>
     <w:p>
+      <w:pPr>
+        <w:spacing w:before="0" w:after="0" w:line="20" w:lineRule="exact"/>
+        <w:ind w:firstLine="0"/>
+        <w:sectPr>
+          <w:headerReference w:type="even" r:id="rId9"/>
+          <w:headerReference w:type="default" r:id="rIdHCap3"/>
+          <w:headerReference w:type="first" r:id="rIdHVazio"/>
+          <w:footerReference w:type="even" r:id="rId10"/>
+          <w:footerReference w:type="default" r:id="rId10"/>
+          <w:footerReference w:type="first" r:id="rId10"/>
+          <w:type w:val="nextPage"/>
+          <w:pgSz w:w="7920" w:h="12240"/>
+          <w:pgMar w:top="1000" w:right="870" w:bottom="1000" w:left="1150" w:header="560" w:footer="560" w:gutter="0"/>
+          <w:cols w:space="720"/>
+          <w:docGrid w:linePitch="360"/>
+        </w:sectPr>
+      </w:pPr>
+    </w:p>
+    <w:p>
+      <w:pPr>
+        <w:keepNext/>
+        <w:spacing w:before="1500" w:after="160" w:line="240" w:lineRule="auto"/>
+        <w:ind w:firstLine="0"/>
+        <w:jc w:val="center"/>
+      </w:pPr>
       <w:r>
-        <w:br w:type="page"/>
+        <w:rPr>
+          <w:rFonts w:ascii="EB Garamond" w:hAnsi="EB Garamond"/>
+          <w:color w:val="555555"/>
+          <w:spacing w:val="40"/>
+          <w:sz w:val="19"/>
+          <w:szCs w:val="19"/>
+        </w:rPr>
+        <w:t xml:space="preserve">CAPÍTULO 4</w:t>
       </w:r>
     </w:p>
     <w:p>
       <w:pPr>
-        <w:pStyle w:val="MyChapterTitle"/>
-        <w:spacing w:before="1440" w:after="560"/>
+        <w:keepNext/>
+        <w:spacing w:before="0" w:after="900" w:line="240" w:lineRule="auto"/>
+        <w:ind w:firstLine="0"/>
+        <w:jc w:val="center"/>
       </w:pPr>
       <w:r>
-        <w:t xml:space="preserve">CAPÍTULO 4 — O PREÇO DE PERTENCER</w:t>
+        <w:rPr>
+          <w:rFonts w:ascii="EB Garamond" w:hAnsi="EB Garamond"/>
+          <w:spacing w:val="10"/>
+          <w:sz w:val="34"/>
+          <w:szCs w:val="34"/>
+        </w:rPr>
+        <w:t xml:space="preserve">O PREÇO DE PERTENCER</w:t>
+      </w:r>
+    </w:p>
+    <w:p>
+      <w:pPr>
+        <w:ind w:firstLine="0"/>
+      </w:pPr>
+      <w:r>
+        <w:rPr>
+          <w:smallCaps/>
+        </w:rPr>
+        <w:t xml:space="preserve">No primeiro ano do</w:t>
+      </w:r>
+      <w:r>
+        <w:t xml:space="preserve"> ensino médio, tanto faz deixou de ser resposta.</w:t>
       </w:r>
     </w:p>
     <w:p>
       <w:r>
-        <w:t xml:space="preserve">No primeiro ano do ensino médio, tanto faz deixou de ser resposta.</w:t>
-      </w:r>
-    </w:p>
-    <w:p>
-      <w:r>
-        <w:t xml:space="preserve">Ninguém anunciou isso numa cartolina. Mas a sala nova, na escola nova, tinha regras que todo mundo parecia ter recebido por escrito menos eu. Aos catorze anos já não bastava ser amiga de todos. Era preciso ser de alguém. As turmas tinham ficado mais duras nas bordas, e quem andava entre elas não era mais sociável; era esquisito, ou pior, era falso. Eu ouvi essa palavra dita sobre outra menina, numa roda no corredor, e senti um frio atrás do pescoço, como se tivessem dito o meu nome.</w:t>
+        <w:t xml:space="preserve">Ninguém anunciou isso numa cartolina. Mas a sala nova, na escola nova, tinha regras que todo mundo parecia ter recebido por escrito menos eu. Aos catorze anos já não bastava ser amiga de todos. Era preciso ser de alguém. Quem andava entre as turmas não era mais sociável; era esquisito, ou pior, era falso. Eu ouvi essa palavra dita sobre outra menina, numa roda no corredor, e senti um frio atrás do pescoço, como se tivessem dito o meu nome.</w:t>
       </w:r>
     </w:p>
     <w:p>
@@ -1018,27 +1171,28 @@
     </w:p>
     <w:p>
       <w:r>
-        <w:t xml:space="preserve">Eram cinco meninas e uns quatro ou cinco meninos que orbitavam em volta delas. Sentavam no fundo, perto da janela, e riam de um jeito que fazia a sala inteira olhar para ver do que estavam rindo. A Débora era o centro. Tinha o cabelo liso de chapinha antes de todo mundo ter chapinha, um celular de flip que ela deixava em cima da carteira como quem deixa uma chave de carro, e uma maneira de olhar as pessoas de cima a baixo que não precisava de palavra nenhuma.</w:t>
+        <w:t xml:space="preserve">Eram cinco meninas e uns quatro ou cinco meninos que orbitavam em volta delas. Sentavam no fundo, perto da janela, e riam de um jeito que fazia a sala inteira olhar para ver do que estavam rindo. A Débora era o centro. Tinha o cabelo liso de chapinha antes de todo mundo ter chapinha, um celular de flip que deixava em cima da carteira como quem deixa uma chave de carro, e uma maneira de olhar as pessoas de cima a baixo que não precisava de palavra nenhuma.</w:t>
       </w:r>
     </w:p>
     <w:p>
       <w:r>
-        <w:t xml:space="preserve">Entrar foi fácil. Isso eu sabia fazer desde a primeira série. Em duas semanas eu tinha aprendido as músicas que elas ouviam, as marcas, os nomes dos meninos do terceiro ano de que elas falavam, a forma certa de revirar os olhos. Pedi para a minha mãe um tênis igual ao da Débora. Minha mãe olhou o preço na vitrine, olhou para mim, e comprou em três vezes. Na primeira vez que eu fui com ele para a escola, a Débora olhou para o meu pé e disse "gostei", e eu passei o dia inteiro sentindo o tênis nos pés como se fosse outra pessoa andando.</w:t>
+        <w:t xml:space="preserve">Entrar foi fácil. Isso eu sabia fazer desde a primeira série. Em duas semanas eu tinha aprendido as músicas que elas ouviam, as marcas, os nomes dos meninos do terceiro ano, a forma certa de revirar os olhos. Pedi para a minha mãe um tênis igual ao da Débora. Minha mãe olhou o preço na vitrine, olhou para mim, e comprou em três vezes. Na primeira vez que eu fui com ele para a escola, a Débora olhou para o meu pé e disse "gostei", e eu passei o dia inteiro sentindo o tênis nos pés como se fosse outra pessoa andando.</w:t>
       </w:r>
     </w:p>
     <w:p>
       <w:r>
-        <w:t xml:space="preserve">Ninguém ali parecia fazer esforço. Elas eram aquilo. Acordavam aquilo. Eu chegava em casa exausta de um jeito que eu não sabia explicar, e à noite, no MSN, com o computador da sala fazendo aquele barulho de modem, eu escrevia e apagava cada frase três vezes antes de mandar. Uma vez fiquei vinte minutos decidindo se punha "kkkkk" ou "hahaha" numa resposta para a Débora. Pus "kkkkk". Ela não respondeu. Passei a noite achando que tinha errado.</w:t>
+        <w:t xml:space="preserve">Ninguém ali parecia fazer esforço. Elas eram aquilo. Eu chegava em casa exausta, e à noite, no MSN, com o computador da sala fazendo aquele barulho de modem, escrevia e apagava cada frase três vezes antes de mandar. Uma vez fiquei vinte minutos decidindo se punha "kkkkk" ou "hahaha" numa resposta para a Débora. Pus "kkkkk". Ela não respondeu. Passei a noite achando que tinha errado.</w:t>
       </w:r>
     </w:p>
     <w:p>
       <w:pPr>
-        <w:spacing w:before="240" w:after="240"/>
+        <w:keepNext/>
+        <w:spacing w:before="200" w:after="200"/>
         <w:ind w:firstLine="0"/>
         <w:jc w:val="center"/>
       </w:pPr>
       <w:r>
-        <w:t xml:space="preserve">*</w:t>
+        <w:t xml:space="preserve">*   *   *</w:t>
       </w:r>
     </w:p>
     <w:p>
@@ -1051,25 +1205,22 @@
     </w:p>
     <w:p>
       <w:r>
-        <w:t xml:space="preserve">Não era por mal, e não era para aparecer. Ela sabia mesmo as respostas e ficava aflita se ninguém dizia. Quando a professora de biologia fazia uma pergunta e a sala ficava em silêncio, a Cíntia aguentava uns três segundos e depois esticava o braço tão alto que o corpo inteiro subia junto na cadeira.</w:t>
+        <w:t xml:space="preserve">Não era para aparecer. Ela sabia mesmo as respostas e ficava aflita se ninguém dizia. Quando a professora de biologia fazia uma pergunta e a sala ficava em silêncio, a Cíntia aguentava uns três segundos e depois esticava o braço tão alto que o corpo inteiro subia junto na cadeira.</w:t>
       </w:r>
     </w:p>
     <w:p>
-      <w:pPr>
-        <w:ind w:firstLine="0"/>
-      </w:pPr>
       <w:r>
         <w:t xml:space="preserve">— Professora, professora!</w:t>
       </w:r>
     </w:p>
     <w:p>
       <w:r>
-        <w:t xml:space="preserve">Ela tinha uma voz fina, um pouco anasalada, e quando ria, ria em soluços, uns "hic" curtos que ela tentava segurar com a mão na boca. Usava o uniforme da escola com a camiseta para dentro da calça. Era a única.</w:t>
+        <w:t xml:space="preserve">Ela tinha uma voz fina, um pouco anasalada, e quando ria, ria em soluços, uns "hic" curtos que tentava segurar com a mão na boca. Usava o uniforme com a camiseta para dentro da calça. Era a única.</w:t>
       </w:r>
     </w:p>
     <w:p>
       <w:r>
-        <w:t xml:space="preserve">Nas primeiras semanas, eu não tinha opinião sobre a Cíntia. Não tinha nem pensado nela. Depois que entrei no grupo, descobri que ali se tinha opinião sobre ela, e que a opinião era sempre a mesma. Ela era a piada de reserva. Quando a conversa esfriava, alguém fazia "professora, professora" com a voz fina, e todo mundo ria. Eu ria também. No começo, um pouco atrasada, só depois de ver os outros rindo. Depois, na hora certa.</w:t>
+        <w:t xml:space="preserve">Nas primeiras semanas, eu não tinha opinião sobre a Cíntia. Depois que entrei no grupo, descobri que ali se tinha opinião sobre ela, e que era sempre a mesma. Ela era a piada de reserva. Quando a conversa esfriava, alguém fazia "professora, professora" com a voz fina, e todo mundo ria. Eu ria também. No começo, um pouco atrasada, só depois de ver os outros rindo. Depois, na hora certa.</w:t>
       </w:r>
     </w:p>
     <w:p>
@@ -1078,25 +1229,16 @@
       </w:r>
     </w:p>
     <w:p>
-      <w:pPr>
-        <w:ind w:firstLine="0"/>
-      </w:pPr>
       <w:r>
         <w:t xml:space="preserve">— Faz a Cíntia.</w:t>
       </w:r>
     </w:p>
     <w:p>
-      <w:pPr>
-        <w:ind w:firstLine="0"/>
-      </w:pPr>
       <w:r>
         <w:t xml:space="preserve">— Quê?</w:t>
       </w:r>
     </w:p>
     <w:p>
-      <w:pPr>
-        <w:ind w:firstLine="0"/>
-      </w:pPr>
       <w:r>
         <w:t xml:space="preserve">— Você imita todo mundo. Eu vi você imitando a de matemática. Faz a Cíntia.</w:t>
       </w:r>
@@ -1113,7 +1255,7 @@
     </w:p>
     <w:p>
       <w:r>
-        <w:t xml:space="preserve">A Cíntia estava sentada na frente, a umas quatro carteiras, lendo o livro de história por conta própria, porque a aula estava vaga e ela não sabia ficar sem fazer nada. Estava de costas. Eu via a nuca dela, o elástico azul no cabelo, a camiseta para dentro da calça.</w:t>
+        <w:t xml:space="preserve">A Cíntia estava sentada na frente, a umas quatro carteiras, lendo o livro de história por conta própria, porque não sabia ficar sem fazer nada. Estava de costas. Eu via a nuca dela, o elástico azul no cabelo, a camiseta para dentro da calça.</w:t>
       </w:r>
     </w:p>
     <w:p>
@@ -1122,25 +1264,16 @@
       </w:r>
     </w:p>
     <w:p>
-      <w:pPr>
-        <w:ind w:firstLine="0"/>
-      </w:pPr>
       <w:r>
         <w:t xml:space="preserve">Eu levantei o braço.</w:t>
       </w:r>
     </w:p>
     <w:p>
-      <w:pPr>
-        <w:ind w:firstLine="0"/>
-      </w:pPr>
       <w:r>
         <w:t xml:space="preserve">Não precisei pensar. O corpo sabia. Estiquei o braço até o ombro subir, deixei a bunda sair um pouco da cadeira, fiz a cara aflita de quem sabe a resposta e está sofrendo com isso, e disse, com a voz fina, anasalada, perfeita:</w:t>
       </w:r>
     </w:p>
     <w:p>
-      <w:pPr>
-        <w:ind w:firstLine="0"/>
-      </w:pPr>
       <w:r>
         <w:t xml:space="preserve">— Professora, professora!</w:t>
       </w:r>
@@ -1152,13 +1285,10 @@
     </w:p>
     <w:p>
       <w:r>
-        <w:t xml:space="preserve">O fundo da sala explodiu. A Débora bateu na carteira com a mão aberta. Um dos meninos caiu da cadeira de propósito. Até quem não era do grupo riu, porque era impossível não rir; estava igual. Eu ri também, com o rosto quente, de um jeito que eu não sabia se era vergonha ou felicidade, e por um segundo não me importou saber.</w:t>
+        <w:t xml:space="preserve">O fundo da sala explodiu. A Débora bateu na carteira com a mão aberta. Um dos meninos caiu da cadeira de propósito. Até quem não era do grupo riu, porque era impossível não rir; estava igual. Eu ri também, com o rosto quente, sem saber se era vergonha ou felicidade, e por um segundo não me importou saber.</w:t>
       </w:r>
     </w:p>
     <w:p>
-      <w:pPr>
-        <w:ind w:firstLine="0"/>
-      </w:pPr>
       <w:r>
         <w:t xml:space="preserve">Então a Cíntia se virou.</w:t>
       </w:r>
@@ -1169,17 +1299,11 @@
       </w:r>
     </w:p>
     <w:p>
-      <w:pPr>
-        <w:ind w:firstLine="0"/>
-      </w:pPr>
       <w:r>
         <w:t xml:space="preserve">Eu abaixei o braço.</w:t>
       </w:r>
     </w:p>
     <w:p>
-      <w:pPr>
-        <w:ind w:firstLine="0"/>
-      </w:pPr>
       <w:r>
         <w:t xml:space="preserve">— Morri — disse a Débora, enxugando o olho. — Você é demais, Lu.</w:t>
       </w:r>
@@ -1191,12 +1315,13 @@
     </w:p>
     <w:p>
       <w:pPr>
-        <w:spacing w:before="240" w:after="240"/>
+        <w:keepNext/>
+        <w:spacing w:before="200" w:after="200"/>
         <w:ind w:firstLine="0"/>
         <w:jc w:val="center"/>
       </w:pPr>
       <w:r>
-        <w:t xml:space="preserve">*</w:t>
+        <w:t xml:space="preserve">*   *   *</w:t>
       </w:r>
     </w:p>
     <w:p>
@@ -1213,17 +1338,11 @@
       </w:r>
     </w:p>
     <w:p>
-      <w:pPr>
-        <w:ind w:firstLine="0"/>
-      </w:pPr>
       <w:r>
         <w:t xml:space="preserve">O braço não subiu.</w:t>
       </w:r>
     </w:p>
     <w:p>
-      <w:pPr>
-        <w:ind w:firstLine="0"/>
-      </w:pPr>
       <w:r>
         <w:t xml:space="preserve">— Ninguém? — disse a professora. — Nem você, Cíntia?</w:t>
       </w:r>
@@ -1239,27 +1358,77 @@
       </w:r>
     </w:p>
     <w:p>
+      <w:pPr>
+        <w:spacing w:before="0" w:after="0" w:line="20" w:lineRule="exact"/>
+        <w:ind w:firstLine="0"/>
+        <w:sectPr>
+          <w:headerReference w:type="even" r:id="rId9"/>
+          <w:headerReference w:type="default" r:id="rIdHCap4"/>
+          <w:headerReference w:type="first" r:id="rIdHVazio"/>
+          <w:footerReference w:type="even" r:id="rId10"/>
+          <w:footerReference w:type="default" r:id="rId10"/>
+          <w:footerReference w:type="first" r:id="rId10"/>
+          <w:type w:val="nextPage"/>
+          <w:pgSz w:w="7920" w:h="12240"/>
+          <w:pgMar w:top="1000" w:right="870" w:bottom="1000" w:left="1150" w:header="560" w:footer="560" w:gutter="0"/>
+          <w:cols w:space="720"/>
+          <w:titlePg/>
+          <w:docGrid w:linePitch="360"/>
+        </w:sectPr>
+      </w:pPr>
+    </w:p>
+    <w:p>
+      <w:pPr>
+        <w:keepNext/>
+        <w:spacing w:before="1500" w:after="160" w:line="240" w:lineRule="auto"/>
+        <w:ind w:firstLine="0"/>
+        <w:jc w:val="center"/>
+      </w:pPr>
       <w:r>
-        <w:br w:type="page"/>
+        <w:rPr>
+          <w:rFonts w:ascii="EB Garamond" w:hAnsi="EB Garamond"/>
+          <w:color w:val="555555"/>
+          <w:spacing w:val="40"/>
+          <w:sz w:val="19"/>
+          <w:szCs w:val="19"/>
+        </w:rPr>
+        <w:t xml:space="preserve">CAPÍTULO 5</w:t>
       </w:r>
     </w:p>
     <w:p>
       <w:pPr>
-        <w:pStyle w:val="MyChapterTitle"/>
-        <w:spacing w:before="1440" w:after="560"/>
+        <w:keepNext/>
+        <w:spacing w:before="0" w:after="900" w:line="240" w:lineRule="auto"/>
+        <w:ind w:firstLine="0"/>
+        <w:jc w:val="center"/>
       </w:pPr>
       <w:r>
-        <w:t xml:space="preserve">CAPÍTULO 5 — O LADO DE DENTRO DA PORTA</w:t>
+        <w:rPr>
+          <w:rFonts w:ascii="EB Garamond" w:hAnsi="EB Garamond"/>
+          <w:spacing w:val="10"/>
+          <w:sz w:val="34"/>
+          <w:szCs w:val="34"/>
+        </w:rPr>
+        <w:t xml:space="preserve">O LADO DE DENTRO DA PORTA</w:t>
+      </w:r>
+    </w:p>
+    <w:p>
+      <w:pPr>
+        <w:ind w:firstLine="0"/>
+      </w:pPr>
+      <w:r>
+        <w:rPr>
+          <w:smallCaps/>
+        </w:rPr>
+        <w:t xml:space="preserve">A Carla tocou a</w:t>
+      </w:r>
+      <w:r>
+        <w:t xml:space="preserve"> campainha numa quarta-feira, quase às onze da noite, com a mochila da escola nas costas e uma sacola de supermercado cheia de roupa.</w:t>
       </w:r>
     </w:p>
     <w:p>
       <w:r>
-        <w:t xml:space="preserve">A Carla tocou a campainha numa quarta-feira, quase às onze da noite, com a mochila da escola nas costas e uma sacola de supermercado cheia de roupa.</w:t>
-      </w:r>
-    </w:p>
-    <w:p>
-      <w:r>
-        <w:t xml:space="preserve">Eu estava no quarto, fingindo estudar química, e reconheci o toque porque ninguém mais tocava daquele jeito, duas vezes rápidas e uma demorada. Era o toque dela desde a quinta série, desde quando a gente morava a três quarteirões uma da outra e ela vinha me buscar para ir a pé para a escola. Mas nunca àquela hora.</w:t>
+        <w:t xml:space="preserve">Eu estava no quarto, fingindo estudar química, e reconheci o toque porque ninguém mais tocava daquele jeito, duas vezes rápidas e uma demorada. Era o toque dela desde a quinta série, quando ela vinha me buscar para ir a pé para a escola. Mas nunca àquela hora.</w:t>
       </w:r>
     </w:p>
     <w:p>
@@ -1268,16 +1437,13 @@
       </w:r>
     </w:p>
     <w:p>
-      <w:pPr>
-        <w:ind w:firstLine="0"/>
-      </w:pPr>
       <w:r>
         <w:t xml:space="preserve">— Entra, filha. Já jantou?</w:t>
       </w:r>
     </w:p>
     <w:p>
       <w:r>
-        <w:t xml:space="preserve">A Carla fez que sim com a cabeça. Era mentira; eu sabia porque ela estava com a boca daquele jeito, seca nos cantos, que ela ficava quando passava o dia sem comer. Minha mãe sabia também, porque foi direto para o fogão e acendeu o fogo embaixo da panela de arroz.</w:t>
+        <w:t xml:space="preserve">A Carla fez que sim com a cabeça. Era mentira; eu sabia porque ela estava com a boca daquele jeito, seca nos cantos, que ficava quando passava o dia sem comer. Minha mãe sabia também, porque foi direto para o fogão e acendeu o fogo embaixo da panela de arroz.</w:t>
       </w:r>
     </w:p>
     <w:p>
@@ -1286,34 +1452,29 @@
       </w:r>
     </w:p>
     <w:p>
-      <w:pPr>
-        <w:ind w:firstLine="0"/>
-      </w:pPr>
       <w:r>
         <w:t xml:space="preserve">— Posso dormir aqui hoje? — perguntou, para mim, e não para a minha mãe.</w:t>
       </w:r>
     </w:p>
     <w:p>
-      <w:pPr>
-        <w:ind w:firstLine="0"/>
-      </w:pPr>
       <w:r>
         <w:t xml:space="preserve">— Claro.</w:t>
       </w:r>
     </w:p>
     <w:p>
       <w:r>
-        <w:t xml:space="preserve">Eu não sabia o que tinha acontecido. Sabia em linhas gerais o que vinha acontecendo havia meses na casa dela, porque ela me contava aos pedaços, no caminho da escola, sempre olhando para a frente, nunca para mim: a mãe dela, as brigas, as noites, as coisas que uma menina da nossa idade não devia ter de ouvir nem de fazer. Eu ouvia tudo e guardava tudo. Mas naquela noite, com ela sentada na nossa cozinha comendo arroz com ovo frito que minha mãe tinha feito em dois minutos, eu entendi que dessa vez era outra coisa. Dessa vez ela tinha trazido as roupas.</w:t>
+        <w:t xml:space="preserve">Eu sabia em linhas gerais o que vinha acontecendo havia meses na casa dela, porque ela me contava aos pedaços, no caminho da escola, sempre olhando para a frente, nunca para mim: a mãe dela, as brigas, as noites, as coisas que uma menina da nossa idade não devia ter de ouvir nem de fazer. Eu ouvia tudo e guardava tudo. Mas naquela noite, com ela sentada na nossa cozinha comendo arroz com ovo frito, eu entendi que dessa vez era outra coisa. Dessa vez ela tinha trazido as roupas.</w:t>
       </w:r>
     </w:p>
     <w:p>
       <w:pPr>
-        <w:spacing w:before="240" w:after="240"/>
+        <w:keepNext/>
+        <w:spacing w:before="200" w:after="200"/>
         <w:ind w:firstLine="0"/>
         <w:jc w:val="center"/>
       </w:pPr>
       <w:r>
-        <w:t xml:space="preserve">*</w:t>
+        <w:t xml:space="preserve">*   *   *</w:t>
       </w:r>
     </w:p>
     <w:p>
@@ -1325,49 +1486,31 @@
       </w:r>
     </w:p>
     <w:p>
-      <w:pPr>
-        <w:ind w:firstLine="0"/>
-      </w:pPr>
       <w:r>
         <w:t xml:space="preserve">No escuro, eu esperei a Carla falar. Ela não falou.</w:t>
       </w:r>
     </w:p>
     <w:p>
-      <w:pPr>
-        <w:ind w:firstLine="0"/>
-      </w:pPr>
       <w:r>
         <w:t xml:space="preserve">— Carla?</w:t>
       </w:r>
     </w:p>
     <w:p>
-      <w:pPr>
-        <w:ind w:firstLine="0"/>
-      </w:pPr>
       <w:r>
         <w:t xml:space="preserve">— Hum.</w:t>
       </w:r>
     </w:p>
     <w:p>
-      <w:pPr>
-        <w:ind w:firstLine="0"/>
-      </w:pPr>
       <w:r>
         <w:t xml:space="preserve">— Você quer contar?</w:t>
       </w:r>
     </w:p>
     <w:p>
-      <w:pPr>
-        <w:ind w:firstLine="0"/>
-      </w:pPr>
       <w:r>
         <w:t xml:space="preserve">— Não.</w:t>
       </w:r>
     </w:p>
     <w:p>
-      <w:pPr>
-        <w:ind w:firstLine="0"/>
-      </w:pPr>
       <w:r>
         <w:t xml:space="preserve">— Tá.</w:t>
       </w:r>
@@ -1378,42 +1521,52 @@
       </w:r>
     </w:p>
     <w:p>
-      <w:pPr>
-        <w:ind w:firstLine="0"/>
-      </w:pPr>
       <w:r>
-        <w:t xml:space="preserve">— A gente pode falar com a coordenadora amanhã. Ou com a sua madrinha. Ou eu peço para a minha mãe ligar...</w:t>
+        <w:t xml:space="preserve">— A gente pode falar com a coordenadora amanhã. Ou com a sua madrinha. Ou eu peço para a minha mãe ligar.</w:t>
       </w:r>
     </w:p>
     <w:p>
-      <w:pPr>
-        <w:ind w:firstLine="0"/>
-      </w:pPr>
       <w:r>
         <w:t xml:space="preserve">— Lu. — A voz dela veio do chão, cansada, sem raiva nenhuma. — Eu só quero dormir sem ninguém perguntar nada. Pode ser?</w:t>
       </w:r>
     </w:p>
     <w:p>
-      <w:pPr>
-        <w:ind w:firstLine="0"/>
-      </w:pPr>
       <w:r>
         <w:t xml:space="preserve">— Pode.</w:t>
       </w:r>
     </w:p>
     <w:p>
       <w:r>
-        <w:t xml:space="preserve">Ela virou de lado, para a parede. Em pouco tempo a respiração dela mudou, ficou comprida e pesada, e eu percebi que ela tinha dormido de verdade, talvez pela primeira vez em muitos dias.</w:t>
+        <w:t xml:space="preserve">Ela virou de lado, para a parede. Em pouco tempo a respiração dela ficou comprida e pesada, e eu percebi que ela tinha dormido de verdade, talvez pela primeira vez em muitos dias.</w:t>
       </w:r>
     </w:p>
     <w:p>
       <w:r>
-        <w:t xml:space="preserve">Eu não dormi. Fiquei deitada de barriga para cima, olhando o teto, fazendo planos. Eu ia falar com a coordenadora. Eu ia descobrir o telefone da madrinha. Eu ia pedir para o meu pai ir lá conversar com a mãe dela, porque meu pai conseguia conversar com qualquer pessoa. Eu ia ajudar nas lições que ela estava perdendo. Eu ia resolver. Cada plano me acalmava um pouco, e eu fui empilhando um em cima do outro até de madrugada, como quem empilha cobertor.</w:t>
+        <w:t xml:space="preserve">Eu não dormi. Fiquei deitada de barriga para cima, fazendo planos. Eu ia falar com a coordenadora. Eu ia descobrir o telefone da madrinha. Eu ia pedir para o meu pai ir lá conversar com a mãe dela, porque meu pai conseguia conversar com qualquer pessoa. Eu ia resolver. Cada plano me acalmava um pouco, e eu fui empilhando um em cima do outro até de madrugada, como quem empilha cobertor.</w:t>
       </w:r>
     </w:p>
     <w:p>
       <w:pPr>
-        <w:pageBreakBefore/>
+        <w:spacing w:before="0" w:after="0" w:line="20" w:lineRule="exact"/>
+        <w:ind w:firstLine="0"/>
+        <w:sectPr>
+          <w:headerReference w:type="even" r:id="rId9"/>
+          <w:headerReference w:type="default" r:id="rIdHCap5"/>
+          <w:headerReference w:type="first" r:id="rIdHVazio"/>
+          <w:footerReference w:type="even" r:id="rId10"/>
+          <w:footerReference w:type="default" r:id="rId10"/>
+          <w:footerReference w:type="first" r:id="rId10"/>
+          <w:type w:val="nextPage"/>
+          <w:pgSz w:w="7920" w:h="12240"/>
+          <w:pgMar w:top="1000" w:right="870" w:bottom="1000" w:left="1150" w:header="560" w:footer="560" w:gutter="0"/>
+          <w:cols w:space="720"/>
+          <w:titlePg/>
+          <w:docGrid w:linePitch="360"/>
+        </w:sectPr>
+      </w:pPr>
+    </w:p>
+    <w:p>
+      <w:pPr>
         <w:spacing w:before="0" w:after="0"/>
         <w:ind w:firstLine="0"/>
       </w:pPr>
@@ -1463,7 +1616,7 @@
     </w:p>
     <w:p>
       <w:pPr>
-        <w:spacing w:before="900" w:after="0" w:line="1144" w:lineRule="exact"/>
+        <w:spacing w:before="900" w:after="0" w:line="1152" w:lineRule="exact"/>
         <w:ind w:firstLine="0"/>
         <w:jc w:val="left"/>
       </w:pPr>
@@ -1516,18 +1669,33 @@
       </w:r>
     </w:p>
     <w:p>
-      <w:r>
-        <w:br w:type="page"/>
-      </w:r>
+      <w:pPr>
+        <w:spacing w:before="0" w:after="0" w:line="20" w:lineRule="exact"/>
+        <w:ind w:firstLine="0"/>
+        <w:sectPr>
+          <w:headerReference w:type="even" r:id="rIdHVazio"/>
+          <w:headerReference w:type="default" r:id="rIdHVazio"/>
+          <w:headerReference w:type="first" r:id="rIdHVazio"/>
+          <w:footerReference w:type="even" r:id="rIdFVazio"/>
+          <w:footerReference w:type="default" r:id="rIdFVazio"/>
+          <w:footerReference w:type="first" r:id="rIdFVazio"/>
+          <w:type w:val="nextPage"/>
+          <w:pgSz w:w="7920" w:h="12240"/>
+          <w:pgMar w:top="1000" w:right="870" w:bottom="1000" w:left="1150" w:header="560" w:footer="560" w:gutter="0"/>
+          <w:cols w:space="720"/>
+          <w:docGrid w:linePitch="360"/>
+        </w:sectPr>
+      </w:pPr>
     </w:p>
     <w:p>
       <w:pPr>
-        <w:spacing w:before="240" w:after="240"/>
+        <w:keepNext/>
+        <w:spacing w:before="200" w:after="200"/>
         <w:ind w:firstLine="0"/>
         <w:jc w:val="center"/>
       </w:pPr>
       <w:r>
-        <w:t xml:space="preserve">*</w:t>
+        <w:t xml:space="preserve">*   *   *</w:t>
       </w:r>
     </w:p>
     <w:p>
@@ -1540,18 +1708,15 @@
     </w:p>
     <w:p>
       <w:r>
-        <w:t xml:space="preserve">Nesses onze dias, eu fiz tudo o que tinha planejado e mais um pouco. Fui com ela na coordenação, e falei eu, porque ela não queria falar. Descobri o telefone da madrinha numa agenda velha que a Carla tinha na mochila e liguei escondida, do orelhão da esquina, com um cartão telefônico que eu tinha comprado com o dinheiro do lanche. Copiei as matérias que ela tinha perdido, emprestei minhas roupas, dividi meu lanche. À noite, eu ficava acordada até ela dormir, só para ter certeza.</w:t>
+        <w:t xml:space="preserve">Nesses onze dias, eu fiz tudo o que tinha planejado e mais um pouco. Fui com ela na coordenação, e falei eu, porque ela não queria falar. Descobri o telefone da madrinha numa agenda velha que a Carla tinha na mochila e liguei escondida, do orelhão da esquina, com um cartão telefônico comprado com o dinheiro do lanche. Copiei as matérias que ela tinha perdido, emprestei minhas roupas, dividi meu lanche. À noite, ficava acordada até ela dormir, só para ter certeza.</w:t>
       </w:r>
     </w:p>
     <w:p>
       <w:r>
-        <w:t xml:space="preserve">Na escola, eu continuava sentando no fundo, com a Débora e as outras, rindo nas horas certas. A Carla nunca tinha sido do grupo e não queria ser. Eu não contei para ninguém o que estava acontecendo na minha casa. No recreio, eu ia de um lado para o outro: dez minutos com a Carla, no banco perto da quadra, e dez com o grupo, perto da cantina. Ninguém perguntou para onde eu ia. Eu era boa naquilo.</w:t>
+        <w:t xml:space="preserve">Na escola, eu continuava sentando no fundo, com a Débora e as outras, rindo nas horas certas. A Carla nunca tinha sido do grupo e não queria ser. No recreio, eu ia de um lado para o outro: dez minutos com a Carla, no banco perto da quadra, e dez com o grupo, perto da cantina. Ninguém perguntou para onde eu ia. Eu era boa naquilo.</w:t>
       </w:r>
     </w:p>
     <w:p>
-      <w:pPr>
-        <w:ind w:firstLine="0"/>
-      </w:pPr>
       <w:r>
         <w:t xml:space="preserve">Quem conseguiu fazer a Carla rir foi meu pai.</w:t>
       </w:r>
@@ -1562,57 +1727,36 @@
       </w:r>
     </w:p>
     <w:p>
-      <w:pPr>
-        <w:ind w:firstLine="0"/>
-      </w:pPr>
       <w:r>
         <w:t xml:space="preserve">— A Lu já me contou.</w:t>
       </w:r>
     </w:p>
     <w:p>
-      <w:pPr>
-        <w:ind w:firstLine="0"/>
-      </w:pPr>
       <w:r>
         <w:t xml:space="preserve">— Contou da baleia?</w:t>
       </w:r>
     </w:p>
     <w:p>
-      <w:pPr>
-        <w:ind w:firstLine="0"/>
-      </w:pPr>
       <w:r>
         <w:t xml:space="preserve">— Contou.</w:t>
       </w:r>
     </w:p>
     <w:p>
-      <w:pPr>
-        <w:ind w:firstLine="0"/>
-      </w:pPr>
       <w:r>
         <w:t xml:space="preserve">— E contou que a baleia olhou para mim?</w:t>
       </w:r>
     </w:p>
     <w:p>
-      <w:pPr>
-        <w:ind w:firstLine="0"/>
-      </w:pPr>
       <w:r>
         <w:t xml:space="preserve">A Carla hesitou.</w:t>
       </w:r>
     </w:p>
     <w:p>
-      <w:pPr>
-        <w:ind w:firstLine="0"/>
-      </w:pPr>
       <w:r>
         <w:t xml:space="preserve">— Não.</w:t>
       </w:r>
     </w:p>
     <w:p>
-      <w:pPr>
-        <w:ind w:firstLine="0"/>
-      </w:pPr>
       <w:r>
         <w:t xml:space="preserve">— Pois olhou. — Ele se inclinou sobre a mesa. — Olhou para mim e disse, em japonês: "Yoshinori, você está muito magro. Come mais arroz."</w:t>
       </w:r>
@@ -1624,12 +1768,13 @@
     </w:p>
     <w:p>
       <w:pPr>
-        <w:spacing w:before="240" w:after="240"/>
+        <w:keepNext/>
+        <w:spacing w:before="200" w:after="200"/>
         <w:ind w:firstLine="0"/>
         <w:jc w:val="center"/>
       </w:pPr>
       <w:r>
-        <w:t xml:space="preserve">*</w:t>
+        <w:t xml:space="preserve">*   *   *</w:t>
       </w:r>
     </w:p>
     <w:p>
@@ -1637,7 +1782,7 @@
         <w:ind w:firstLine="0"/>
       </w:pPr>
       <w:r>
-        <w:t xml:space="preserve">No décimo primeiro dia, a madrinha da Carla veio buscá-la de carro. Era uma mulher alta, de cabelo curto, que abraçou minha mãe na porta como se as duas se conhecessem havia anos e agradeceu tantas vezes que minha mãe ficou sem jeito. A Carla ia morar com ela por um tempo. Ninguém disse quanto.</w:t>
+        <w:t xml:space="preserve">No décimo primeiro dia, a madrinha da Carla veio buscá-la de carro. Era uma mulher alta, de cabelo curto, que abraçou minha mãe na porta e agradeceu tantas vezes que minha mãe ficou sem jeito. A Carla ia morar com ela por um tempo. Ninguém disse quanto.</w:t>
       </w:r>
     </w:p>
     <w:p>
@@ -1647,47 +1792,35 @@
     </w:p>
     <w:p>
       <w:r>
-        <w:t xml:space="preserve">À noite, minha mãe entrou no meu quarto para ajudar a guardar o colchonete. Dobramos o lençol de florzinha juntas, ela pegando numa ponta e eu na outra, e quando as pontas se encontraram no meio ela ficou segurando o lençol e olhando para mim.</w:t>
+        <w:t xml:space="preserve">À noite, minha mãe entrou no meu quarto para ajudar a guardar o colchonete. Dobramos o lençol de florzinha juntas, ela numa ponta e eu na outra, e quando as pontas se encontraram no meio ela ficou segurando o lençol e olhando para mim.</w:t>
       </w:r>
     </w:p>
     <w:p>
-      <w:pPr>
-        <w:ind w:firstLine="0"/>
-      </w:pPr>
       <w:r>
         <w:t xml:space="preserve">— E você, filha?</w:t>
       </w:r>
     </w:p>
     <w:p>
-      <w:pPr>
-        <w:ind w:firstLine="0"/>
-      </w:pPr>
       <w:r>
         <w:t xml:space="preserve">— Eu o quê?</w:t>
       </w:r>
     </w:p>
     <w:p>
-      <w:pPr>
-        <w:ind w:firstLine="0"/>
-      </w:pPr>
       <w:r>
         <w:t xml:space="preserve">— Você está magrinha. Está com uma cara cansada. Está tudo bem com você?</w:t>
       </w:r>
     </w:p>
     <w:p>
       <w:r>
-        <w:t xml:space="preserve">Eu pensei na Cíntia. No braço que não subia mais. Na Débora me esperando no portão, no tênis em três vezes, nos vinte minutos para decidir entre "kkkkk" e "hahaha". Pensei em todas as noites acordada, ouvindo a respiração da Carla, e numa coisa estranha que eu vinha sentindo no peito e que não tinha nome.</w:t>
+        <w:t xml:space="preserve">Eu pensei na Cíntia. No braço que não subia mais. Na Débora me esperando no portão, no tênis em três vezes, nos vinte minutos entre "kkkkk" e "hahaha". Pensei em todas as noites acordada, ouvindo a respiração da Carla, e numa coisa que eu vinha sentindo no peito e que não tinha nome.</w:t>
       </w:r>
     </w:p>
     <w:p>
       <w:r>
-        <w:t xml:space="preserve">Depois pensei na sacola de roupas da Carla. Na boca seca nos cantos. Nas coisas que ela me contava olhando para a frente.</w:t>
+        <w:t xml:space="preserve">Depois pensei na sacola de roupas da Carla. Na boca seca nos cantos.</w:t>
       </w:r>
     </w:p>
     <w:p>
-      <w:pPr>
-        <w:ind w:firstLine="0"/>
-      </w:pPr>
       <w:r>
         <w:t xml:space="preserve">— O meu não é nada, mãe — eu disse, e peguei o lençol da mão dela para terminar de dobrar. — Tem gente passando por coisa muito pior.</w:t>
       </w:r>
@@ -1703,10 +1836,15 @@
       </w:r>
     </w:p>
     <w:sectPr>
-      <w:headerReference w:type="default" r:id="rId9"/>
+      <w:headerReference w:type="even" r:id="rId9"/>
+      <w:headerReference w:type="default" r:id="rIdHCap5"/>
+      <w:headerReference w:type="first" r:id="rIdHVazio"/>
+      <w:footerReference w:type="even" r:id="rId10"/>
       <w:footerReference w:type="default" r:id="rId10"/>
+      <w:footerReference w:type="first" r:id="rId10"/>
+      <w:type w:val="nextPage"/>
       <w:pgSz w:w="7920" w:h="12240"/>
-      <w:pgMar w:top="1037" w:right="979" w:bottom="1037" w:left="1123" w:header="403" w:footer="461" w:gutter="0"/>
+      <w:pgMar w:top="1000" w:right="870" w:bottom="1000" w:left="1150" w:header="560" w:footer="560" w:gutter="0"/>
       <w:cols w:space="720"/>
       <w:docGrid w:linePitch="360"/>
     </w:sectPr>
@@ -1734,6 +1872,17 @@
 </w:ftr>
 </file>
 
+<file path=word/footer_vazio.xml><?xml version="1.0" encoding="utf-8"?>
+<w:ftr xmlns:m="http://schemas.openxmlformats.org/officeDocument/2006/math" xmlns:mc="http://schemas.openxmlformats.org/markup-compatibility/2006" xmlns:mo="http://schemas.microsoft.com/office/mac/office/2008/main" xmlns:mv="urn:schemas-microsoft-com:mac:vml" xmlns:o="urn:schemas-microsoft-com:office:office" xmlns:r="http://schemas.openxmlformats.org/officeDocument/2006/relationships" xmlns:v="urn:schemas-microsoft-com:vml" xmlns:w10="urn:schemas-microsoft-com:office:word" xmlns:w14="http://schemas.microsoft.com/office/word/2010/wordml" xmlns:w="http://schemas.openxmlformats.org/wordprocessingml/2006/main" xmlns:wne="http://schemas.microsoft.com/office/word/2006/wordml" xmlns:wp14="http://schemas.microsoft.com/office/word/2010/wordprocessingDrawing" xmlns:wp="http://schemas.openxmlformats.org/drawingml/2006/wordprocessingDrawing" xmlns:wpc="http://schemas.microsoft.com/office/word/2010/wordprocessingCanvas" xmlns:wpg="http://schemas.microsoft.com/office/word/2010/wordprocessingGroup" xmlns:wpi="http://schemas.microsoft.com/office/word/2010/wordprocessingInk" xmlns:wps="http://schemas.microsoft.com/office/word/2010/wordprocessingShape" mc:Ignorable="w14 wp14">
+  <w:p>
+    <w:pPr>
+      <w:pStyle w:val="Header"/>
+      <w:jc w:val="center"/>
+    </w:pPr>
+  </w:p>
+</w:ftr>
+</file>
+
 <file path=word/header1.xml><?xml version="1.0" encoding="utf-8"?>
 <w:hdr xmlns:m="http://schemas.openxmlformats.org/officeDocument/2006/math" xmlns:mc="http://schemas.openxmlformats.org/markup-compatibility/2006" xmlns:mo="http://schemas.microsoft.com/office/mac/office/2008/main" xmlns:mv="urn:schemas-microsoft-com:mac:vml" xmlns:o="urn:schemas-microsoft-com:office:office" xmlns:r="http://schemas.openxmlformats.org/officeDocument/2006/relationships" xmlns:v="urn:schemas-microsoft-com:vml" xmlns:w10="urn:schemas-microsoft-com:office:word" xmlns:w14="http://schemas.microsoft.com/office/word/2010/wordml" xmlns:w="http://schemas.openxmlformats.org/wordprocessingml/2006/main" xmlns:wne="http://schemas.microsoft.com/office/word/2006/wordml" xmlns:wp14="http://schemas.microsoft.com/office/word/2010/wordprocessingDrawing" xmlns:wp="http://schemas.openxmlformats.org/drawingml/2006/wordprocessingDrawing" xmlns:wpc="http://schemas.microsoft.com/office/word/2010/wordprocessingCanvas" xmlns:wpg="http://schemas.microsoft.com/office/word/2010/wordprocessingGroup" xmlns:wpi="http://schemas.microsoft.com/office/word/2010/wordprocessingInk" xmlns:wps="http://schemas.microsoft.com/office/word/2010/wordprocessingShape" mc:Ignorable="w14 wp14">
   <w:p>
@@ -1749,6 +1898,112 @@
       </w:rPr>
       <w:t>A MENINA ELEFANTE</w:t>
     </w:r>
+  </w:p>
+</w:hdr>
+</file>
+
+<file path=word/header_cap1.xml><?xml version="1.0" encoding="utf-8"?>
+<w:hdr xmlns:m="http://schemas.openxmlformats.org/officeDocument/2006/math" xmlns:mc="http://schemas.openxmlformats.org/markup-compatibility/2006" xmlns:mo="http://schemas.microsoft.com/office/mac/office/2008/main" xmlns:mv="urn:schemas-microsoft-com:mac:vml" xmlns:o="urn:schemas-microsoft-com:office:office" xmlns:r="http://schemas.openxmlformats.org/officeDocument/2006/relationships" xmlns:v="urn:schemas-microsoft-com:vml" xmlns:w10="urn:schemas-microsoft-com:office:word" xmlns:w14="http://schemas.microsoft.com/office/word/2010/wordml" xmlns:w="http://schemas.openxmlformats.org/wordprocessingml/2006/main" xmlns:wne="http://schemas.microsoft.com/office/word/2006/wordml" xmlns:wp14="http://schemas.microsoft.com/office/word/2010/wordprocessingDrawing" xmlns:wp="http://schemas.openxmlformats.org/drawingml/2006/wordprocessingDrawing" xmlns:wpc="http://schemas.microsoft.com/office/word/2010/wordprocessingCanvas" xmlns:wpg="http://schemas.microsoft.com/office/word/2010/wordprocessingGroup" xmlns:wpi="http://schemas.microsoft.com/office/word/2010/wordprocessingInk" xmlns:wps="http://schemas.microsoft.com/office/word/2010/wordprocessingShape" mc:Ignorable="w14 wp14">
+  <w:p>
+    <w:pPr>
+      <w:pStyle w:val="Header"/>
+      <w:jc w:val="center"/>
+    </w:pPr>
+    <w:r>
+      <w:rPr>
+        <w:rFonts w:ascii="EB Garamond" w:hAnsi="EB Garamond"/>
+        <w:i/>
+        <w:sz w:val="17"/>
+      </w:rPr>
+      <w:t xml:space="preserve">A FRANJINHA</w:t>
+    </w:r>
+  </w:p>
+</w:hdr>
+</file>
+
+<file path=word/header_cap2.xml><?xml version="1.0" encoding="utf-8"?>
+<w:hdr xmlns:m="http://schemas.openxmlformats.org/officeDocument/2006/math" xmlns:mc="http://schemas.openxmlformats.org/markup-compatibility/2006" xmlns:mo="http://schemas.microsoft.com/office/mac/office/2008/main" xmlns:mv="urn:schemas-microsoft-com:mac:vml" xmlns:o="urn:schemas-microsoft-com:office:office" xmlns:r="http://schemas.openxmlformats.org/officeDocument/2006/relationships" xmlns:v="urn:schemas-microsoft-com:vml" xmlns:w10="urn:schemas-microsoft-com:office:word" xmlns:w14="http://schemas.microsoft.com/office/word/2010/wordml" xmlns:w="http://schemas.openxmlformats.org/wordprocessingml/2006/main" xmlns:wne="http://schemas.microsoft.com/office/word/2006/wordml" xmlns:wp14="http://schemas.microsoft.com/office/word/2010/wordprocessingDrawing" xmlns:wp="http://schemas.openxmlformats.org/drawingml/2006/wordprocessingDrawing" xmlns:wpc="http://schemas.microsoft.com/office/word/2010/wordprocessingCanvas" xmlns:wpg="http://schemas.microsoft.com/office/word/2010/wordprocessingGroup" xmlns:wpi="http://schemas.microsoft.com/office/word/2010/wordprocessingInk" xmlns:wps="http://schemas.microsoft.com/office/word/2010/wordprocessingShape" mc:Ignorable="w14 wp14">
+  <w:p>
+    <w:pPr>
+      <w:pStyle w:val="Header"/>
+      <w:jc w:val="center"/>
+    </w:pPr>
+    <w:r>
+      <w:rPr>
+        <w:rFonts w:ascii="EB Garamond" w:hAnsi="EB Garamond"/>
+        <w:i/>
+        <w:sz w:val="17"/>
+      </w:rPr>
+      <w:t xml:space="preserve">O NAVIO E OS DOZE</w:t>
+    </w:r>
+  </w:p>
+</w:hdr>
+</file>
+
+<file path=word/header_cap3.xml><?xml version="1.0" encoding="utf-8"?>
+<w:hdr xmlns:m="http://schemas.openxmlformats.org/officeDocument/2006/math" xmlns:mc="http://schemas.openxmlformats.org/markup-compatibility/2006" xmlns:mo="http://schemas.microsoft.com/office/mac/office/2008/main" xmlns:mv="urn:schemas-microsoft-com:mac:vml" xmlns:o="urn:schemas-microsoft-com:office:office" xmlns:r="http://schemas.openxmlformats.org/officeDocument/2006/relationships" xmlns:v="urn:schemas-microsoft-com:vml" xmlns:w10="urn:schemas-microsoft-com:office:word" xmlns:w14="http://schemas.microsoft.com/office/word/2010/wordml" xmlns:w="http://schemas.openxmlformats.org/wordprocessingml/2006/main" xmlns:wne="http://schemas.microsoft.com/office/word/2006/wordml" xmlns:wp14="http://schemas.microsoft.com/office/word/2010/wordprocessingDrawing" xmlns:wp="http://schemas.openxmlformats.org/drawingml/2006/wordprocessingDrawing" xmlns:wpc="http://schemas.microsoft.com/office/word/2010/wordprocessingCanvas" xmlns:wpg="http://schemas.microsoft.com/office/word/2010/wordprocessingGroup" xmlns:wpi="http://schemas.microsoft.com/office/word/2010/wordprocessingInk" xmlns:wps="http://schemas.microsoft.com/office/word/2010/wordprocessingShape" mc:Ignorable="w14 wp14">
+  <w:p>
+    <w:pPr>
+      <w:pStyle w:val="Header"/>
+      <w:jc w:val="center"/>
+    </w:pPr>
+    <w:r>
+      <w:rPr>
+        <w:rFonts w:ascii="EB Garamond" w:hAnsi="EB Garamond"/>
+        <w:i/>
+        <w:sz w:val="17"/>
+      </w:rPr>
+      <w:t xml:space="preserve">O CAMALEÃO</w:t>
+    </w:r>
+  </w:p>
+</w:hdr>
+</file>
+
+<file path=word/header_cap4.xml><?xml version="1.0" encoding="utf-8"?>
+<w:hdr xmlns:m="http://schemas.openxmlformats.org/officeDocument/2006/math" xmlns:mc="http://schemas.openxmlformats.org/markup-compatibility/2006" xmlns:mo="http://schemas.microsoft.com/office/mac/office/2008/main" xmlns:mv="urn:schemas-microsoft-com:mac:vml" xmlns:o="urn:schemas-microsoft-com:office:office" xmlns:r="http://schemas.openxmlformats.org/officeDocument/2006/relationships" xmlns:v="urn:schemas-microsoft-com:vml" xmlns:w10="urn:schemas-microsoft-com:office:word" xmlns:w14="http://schemas.microsoft.com/office/word/2010/wordml" xmlns:w="http://schemas.openxmlformats.org/wordprocessingml/2006/main" xmlns:wne="http://schemas.microsoft.com/office/word/2006/wordml" xmlns:wp14="http://schemas.microsoft.com/office/word/2010/wordprocessingDrawing" xmlns:wp="http://schemas.openxmlformats.org/drawingml/2006/wordprocessingDrawing" xmlns:wpc="http://schemas.microsoft.com/office/word/2010/wordprocessingCanvas" xmlns:wpg="http://schemas.microsoft.com/office/word/2010/wordprocessingGroup" xmlns:wpi="http://schemas.microsoft.com/office/word/2010/wordprocessingInk" xmlns:wps="http://schemas.microsoft.com/office/word/2010/wordprocessingShape" mc:Ignorable="w14 wp14">
+  <w:p>
+    <w:pPr>
+      <w:pStyle w:val="Header"/>
+      <w:jc w:val="center"/>
+    </w:pPr>
+    <w:r>
+      <w:rPr>
+        <w:rFonts w:ascii="EB Garamond" w:hAnsi="EB Garamond"/>
+        <w:i/>
+        <w:sz w:val="17"/>
+      </w:rPr>
+      <w:t xml:space="preserve">O PREÇO DE PERTENCER</w:t>
+    </w:r>
+  </w:p>
+</w:hdr>
+</file>
+
+<file path=word/header_cap5.xml><?xml version="1.0" encoding="utf-8"?>
+<w:hdr xmlns:m="http://schemas.openxmlformats.org/officeDocument/2006/math" xmlns:mc="http://schemas.openxmlformats.org/markup-compatibility/2006" xmlns:mo="http://schemas.microsoft.com/office/mac/office/2008/main" xmlns:mv="urn:schemas-microsoft-com:mac:vml" xmlns:o="urn:schemas-microsoft-com:office:office" xmlns:r="http://schemas.openxmlformats.org/officeDocument/2006/relationships" xmlns:v="urn:schemas-microsoft-com:vml" xmlns:w10="urn:schemas-microsoft-com:office:word" xmlns:w14="http://schemas.microsoft.com/office/word/2010/wordml" xmlns:w="http://schemas.openxmlformats.org/wordprocessingml/2006/main" xmlns:wne="http://schemas.microsoft.com/office/word/2006/wordml" xmlns:wp14="http://schemas.microsoft.com/office/word/2010/wordprocessingDrawing" xmlns:wp="http://schemas.openxmlformats.org/drawingml/2006/wordprocessingDrawing" xmlns:wpc="http://schemas.microsoft.com/office/word/2010/wordprocessingCanvas" xmlns:wpg="http://schemas.microsoft.com/office/word/2010/wordprocessingGroup" xmlns:wpi="http://schemas.microsoft.com/office/word/2010/wordprocessingInk" xmlns:wps="http://schemas.microsoft.com/office/word/2010/wordprocessingShape" mc:Ignorable="w14 wp14">
+  <w:p>
+    <w:pPr>
+      <w:pStyle w:val="Header"/>
+      <w:jc w:val="center"/>
+    </w:pPr>
+    <w:r>
+      <w:rPr>
+        <w:rFonts w:ascii="EB Garamond" w:hAnsi="EB Garamond"/>
+        <w:i/>
+        <w:sz w:val="17"/>
+      </w:rPr>
+      <w:t xml:space="preserve">O LADO DE DENTRO DA PORTA</w:t>
+    </w:r>
+  </w:p>
+</w:hdr>
+</file>
+
+<file path=word/header_vazio.xml><?xml version="1.0" encoding="utf-8"?>
+<w:hdr xmlns:m="http://schemas.openxmlformats.org/officeDocument/2006/math" xmlns:mc="http://schemas.openxmlformats.org/markup-compatibility/2006" xmlns:mo="http://schemas.microsoft.com/office/mac/office/2008/main" xmlns:mv="urn:schemas-microsoft-com:mac:vml" xmlns:o="urn:schemas-microsoft-com:office:office" xmlns:r="http://schemas.openxmlformats.org/officeDocument/2006/relationships" xmlns:v="urn:schemas-microsoft-com:vml" xmlns:w10="urn:schemas-microsoft-com:office:word" xmlns:w14="http://schemas.microsoft.com/office/word/2010/wordml" xmlns:w="http://schemas.openxmlformats.org/wordprocessingml/2006/main" xmlns:wne="http://schemas.microsoft.com/office/word/2006/wordml" xmlns:wp14="http://schemas.microsoft.com/office/word/2010/wordprocessingDrawing" xmlns:wp="http://schemas.openxmlformats.org/drawingml/2006/wordprocessingDrawing" xmlns:wpc="http://schemas.microsoft.com/office/word/2010/wordprocessingCanvas" xmlns:wpg="http://schemas.microsoft.com/office/word/2010/wordprocessingGroup" xmlns:wpi="http://schemas.microsoft.com/office/word/2010/wordprocessingInk" xmlns:wps="http://schemas.microsoft.com/office/word/2010/wordprocessingShape" mc:Ignorable="w14 wp14">
+  <w:p>
+    <w:pPr>
+      <w:pStyle w:val="Header"/>
+      <w:jc w:val="center"/>
+    </w:pPr>
   </w:p>
 </w:hdr>
 </file>
@@ -1964,7 +2219,7 @@
         <w:rFonts w:asciiTheme="minorHAnsi" w:eastAsiaTheme="minorEastAsia" w:hAnsiTheme="minorHAnsi" w:cstheme="minorBidi"/>
         <w:sz w:val="22"/>
         <w:szCs w:val="22"/>
-        <w:lang w:val="en-US" w:eastAsia="en-US" w:bidi="ar-SA"/>
+        <w:lang w:val="pt-BR" w:eastAsia="ja-JP" w:bidi="ar-SA"/>
       </w:rPr>
     </w:rPrDefault>
     <w:pPrDefault>
@@ -2115,15 +2370,17 @@
   <w:style w:type="paragraph" w:default="1" w:styleId="Normal">
     <w:name w:val="Normal"/>
     <w:qFormat/>
-    <w:rsid w:val="00FC693F"/>
-    <w:pPr>
-      <w:spacing w:line="307" w:lineRule="auto" w:after="44"/>
-      <w:ind w:firstLine="331"/>
+    <w:pPr>
+      <w:widowControl/>
+      <w:spacing w:after="0" w:line="352" w:lineRule="exact"/>
+      <w:ind w:firstLine="340"/>
       <w:jc w:val="both"/>
     </w:pPr>
     <w:rPr>
-      <w:rFonts w:ascii="EB Garamond" w:hAnsi="EB Garamond" w:eastAsia="EB Garamond"/>
-      <w:sz w:val="26"/>
+      <w:rFonts w:ascii="EB Garamond" w:hAnsi="EB Garamond" w:eastAsia="EB Garamond" w:cs="EB Garamond"/>
+      <w:sz w:val="24"/>
+      <w:szCs w:val="24"/>
+      <w:lang w:val="pt-BR"/>
     </w:rPr>
   </w:style>
   <w:style w:type="paragraph" w:styleId="Header">
@@ -2139,6 +2396,8 @@
         <w:tab w:val="right" w:pos="9360"/>
       </w:tabs>
       <w:spacing w:after="0" w:line="240" w:lineRule="auto"/>
+      <w:ind w:firstLine="0"/>
+      <w:jc w:val="center"/>
     </w:pPr>
   </w:style>
   <w:style w:type="character" w:customStyle="1" w:styleId="HeaderChar">
@@ -2161,6 +2420,8 @@
         <w:tab w:val="right" w:pos="9360"/>
       </w:tabs>
       <w:spacing w:after="0" w:line="240" w:lineRule="auto"/>
+      <w:ind w:firstLine="0"/>
+      <w:jc w:val="center"/>
     </w:pPr>
   </w:style>
   <w:style w:type="character" w:customStyle="1" w:styleId="FooterChar">

</xml_diff>

<commit_message>
A Menina Elefante: ramos de oliveira maiores, meia coroa e azeitonas em parte das páginas
Co-Authored-By: Claude Opus 5.5 <noreply@anthropic.com>
Claude-Session: https://claude.ai/code/session_011ZTeK22H8KBNtWenzEUTZE
</commit_message>
<xml_diff>
--- a/menina_elefante/saidas/A_Menina_Elefante_V2_Parte_I.docx
+++ b/menina_elefante/saidas/A_Menina_Elefante_V2_Parte_I.docx
@@ -309,7 +309,7 @@
               <a:graphicData uri="http://schemas.openxmlformats.org/drawingml/2006/picture">
                 <pic:pic xmlns:pic="http://schemas.openxmlformats.org/drawingml/2006/picture">
                   <pic:nvPicPr>
-                    <pic:cNvPr id="1001" name="destaque_oliveira_cruzada_dir.png"/>
+                    <pic:cNvPr id="1001" name="destaque_oliveira_coroa_dir.png"/>
                     <pic:cNvPicPr/>
                   </pic:nvPicPr>
                   <pic:blipFill>
@@ -336,7 +336,7 @@
     </w:p>
     <w:p>
       <w:pPr>
-        <w:spacing w:before="900" w:after="0" w:line="940" w:lineRule="exact"/>
+        <w:spacing w:before="900" w:after="0" w:line="888" w:lineRule="exact"/>
         <w:ind w:firstLine="0"/>
         <w:jc w:val="left"/>
       </w:pPr>
@@ -345,8 +345,8 @@
           <w:rFonts w:ascii="Bebas Neue" w:hAnsi="Bebas Neue" w:cs="Bebas Neue"/>
           <w:caps/>
           <w:color w:val="A9A9A4"/>
-          <w:sz w:val="92"/>
-          <w:szCs w:val="92"/>
+          <w:sz w:val="86"/>
+          <w:szCs w:val="86"/>
         </w:rPr>
         <w:t xml:space="preserve">FILHA, NINGUÉM VAI OLHAR PARA A </w:t>
       </w:r>
@@ -355,8 +355,8 @@
           <w:rFonts w:ascii="Bebas Neue" w:hAnsi="Bebas Neue" w:cs="Bebas Neue"/>
           <w:caps/>
           <w:color w:val="FFFFFF"/>
-          <w:sz w:val="92"/>
-          <w:szCs w:val="92"/>
+          <w:sz w:val="86"/>
+          <w:szCs w:val="86"/>
         </w:rPr>
         <w:t xml:space="preserve">SUA FRANJA</w:t>
       </w:r>
@@ -365,8 +365,8 @@
           <w:rFonts w:ascii="Bebas Neue" w:hAnsi="Bebas Neue" w:cs="Bebas Neue"/>
           <w:caps/>
           <w:color w:val="A9A9A4"/>
-          <w:sz w:val="92"/>
-          <w:szCs w:val="92"/>
+          <w:sz w:val="86"/>
+          <w:szCs w:val="86"/>
         </w:rPr>
         <w:t xml:space="preserve">. VÃO OLHAR PARA O VESTIDO.</w:t>
       </w:r>
@@ -911,7 +911,7 @@
               <a:graphicData uri="http://schemas.openxmlformats.org/drawingml/2006/picture">
                 <pic:pic xmlns:pic="http://schemas.openxmlformats.org/drawingml/2006/picture">
                   <pic:nvPicPr>
-                    <pic:cNvPr id="1002" name="destaque_oliveira_arco_esq.png"/>
+                    <pic:cNvPr id="1002" name="destaque_oliveira_cruzada_esq.png"/>
                     <pic:cNvPicPr/>
                   </pic:nvPicPr>
                   <pic:blipFill>
@@ -938,7 +938,7 @@
     </w:p>
     <w:p>
       <w:pPr>
-        <w:spacing w:before="900" w:after="0" w:line="933" w:lineRule="exact"/>
+        <w:spacing w:before="900" w:after="0" w:line="881" w:lineRule="exact"/>
         <w:ind w:firstLine="0"/>
         <w:jc w:val="right"/>
       </w:pPr>
@@ -947,8 +947,8 @@
           <w:rFonts w:ascii="Bebas Neue" w:hAnsi="Bebas Neue" w:cs="Bebas Neue"/>
           <w:caps/>
           <w:color w:val="A9A9A4"/>
-          <w:sz w:val="90"/>
-          <w:szCs w:val="90"/>
+          <w:sz w:val="86"/>
+          <w:szCs w:val="86"/>
         </w:rPr>
         <w:t xml:space="preserve">EM CADA LUGAR, EU ERA </w:t>
       </w:r>
@@ -957,8 +957,8 @@
           <w:rFonts w:ascii="Bebas Neue" w:hAnsi="Bebas Neue" w:cs="Bebas Neue"/>
           <w:caps/>
           <w:color w:val="FFFFFF"/>
-          <w:sz w:val="90"/>
-          <w:szCs w:val="90"/>
+          <w:sz w:val="86"/>
+          <w:szCs w:val="86"/>
         </w:rPr>
         <w:t xml:space="preserve">UM POUCO OUTRA</w:t>
       </w:r>
@@ -967,8 +967,8 @@
           <w:rFonts w:ascii="Bebas Neue" w:hAnsi="Bebas Neue" w:cs="Bebas Neue"/>
           <w:caps/>
           <w:color w:val="A9A9A4"/>
-          <w:sz w:val="90"/>
-          <w:szCs w:val="90"/>
+          <w:sz w:val="86"/>
+          <w:szCs w:val="86"/>
         </w:rPr>
         <w:t xml:space="preserve">. E EM CADA LUGAR GOSTAVAM DE MIM.</w:t>
       </w:r>
@@ -1589,7 +1589,7 @@
               <a:graphicData uri="http://schemas.openxmlformats.org/drawingml/2006/picture">
                 <pic:pic xmlns:pic="http://schemas.openxmlformats.org/drawingml/2006/picture">
                   <pic:nvPicPr>
-                    <pic:cNvPr id="1003" name="destaque_oliveira_longa_dir.png"/>
+                    <pic:cNvPr id="1003" name="destaque_oliveira_arco_dir_azeitonas.png"/>
                     <pic:cNvPicPr/>
                   </pic:nvPicPr>
                   <pic:blipFill>
@@ -1616,7 +1616,7 @@
     </w:p>
     <w:p>
       <w:pPr>
-        <w:spacing w:before="900" w:after="0" w:line="1152" w:lineRule="exact"/>
+        <w:spacing w:before="900" w:after="0" w:line="1087" w:lineRule="exact"/>
         <w:ind w:firstLine="0"/>
         <w:jc w:val="left"/>
       </w:pPr>
@@ -1625,8 +1625,8 @@
           <w:rFonts w:ascii="Bebas Neue" w:hAnsi="Bebas Neue" w:cs="Bebas Neue"/>
           <w:caps/>
           <w:color w:val="A9A9A4"/>
-          <w:sz w:val="112"/>
-          <w:szCs w:val="112"/>
+          <w:sz w:val="106"/>
+          <w:szCs w:val="106"/>
         </w:rPr>
         <w:t xml:space="preserve">EU SÓ QUERO DORMIR </w:t>
       </w:r>
@@ -1635,8 +1635,8 @@
           <w:rFonts w:ascii="Bebas Neue" w:hAnsi="Bebas Neue" w:cs="Bebas Neue"/>
           <w:caps/>
           <w:color w:val="FFFFFF"/>
-          <w:sz w:val="112"/>
-          <w:szCs w:val="112"/>
+          <w:sz w:val="106"/>
+          <w:szCs w:val="106"/>
         </w:rPr>
         <w:t xml:space="preserve">SEM NINGUÉM PERGUNTAR NADA</w:t>
       </w:r>
@@ -1645,8 +1645,8 @@
           <w:rFonts w:ascii="Bebas Neue" w:hAnsi="Bebas Neue" w:cs="Bebas Neue"/>
           <w:caps/>
           <w:color w:val="A9A9A4"/>
-          <w:sz w:val="112"/>
-          <w:szCs w:val="112"/>
+          <w:sz w:val="106"/>
+          <w:szCs w:val="106"/>
         </w:rPr>
         <w:t xml:space="preserve">.</w:t>
       </w:r>

</xml_diff>